<commit_message>
Split merged docs into individual files
Extracted Design Thinking, Market Opportunity Analysis (from Business Model Canvas.docx) and Opportunity Scoring System (from Competitive Intelligence.docx) into their own files, and cleaned the two source files to contain only their own content.
</commit_message>
<xml_diff>
--- a/Competitive Intelligence.docx
+++ b/Competitive Intelligence.docx
@@ -3148,3167 +3148,6 @@
           <w:rtl w:val="0"/>
         </w:rPr>
         <w:t xml:space="preserve">Recommended Strategy:</w:t>
-      </w:r>
-    </w:p>
-    <w:p>
-      <w:pPr>
-        <w:pStyle w:val="Heading1"/>
-        <w:keepNext w:val="0"/>
-        <w:keepLines w:val="0"/>
-        <w:spacing w:before="480" w:lineRule="auto"/>
-        <w:rPr>
-          <w:b w:val="1"/>
-          <w:bCs w:val="1"/>
-          <w:sz w:val="46"/>
-          <w:szCs w:val="46"/>
-        </w:rPr>
-      </w:pPr>
-      <w:bookmarkStart w:colFirst="0" w:colLast="0" w:name="_ezvhb9sobydd" w:id="42"/>
-      <w:bookmarkEnd w:id="42"/>
-      <w:r>
-        <w:rPr>
-          <w:b w:val="1"/>
-          <w:bCs w:val="1"/>
-          <w:sz w:val="46"/>
-          <w:szCs w:val="46"/>
-          <w:rtl w:val="0"/>
-        </w:rPr>
-        <w:t xml:space="preserve">Opportunity Scoring System</w:t>
-      </w:r>
-    </w:p>
-    <w:p>
-      <w:pPr>
-        <w:pStyle w:val="Heading2"/>
-        <w:keepNext w:val="0"/>
-        <w:keepLines w:val="0"/>
-        <w:spacing w:after="80" w:lineRule="auto"/>
-        <w:rPr>
-          <w:b w:val="1"/>
-          <w:bCs w:val="1"/>
-          <w:sz w:val="34"/>
-          <w:szCs w:val="34"/>
-        </w:rPr>
-      </w:pPr>
-      <w:bookmarkStart w:colFirst="0" w:colLast="0" w:name="_tofcq6xc52k" w:id="43"/>
-      <w:bookmarkEnd w:id="43"/>
-      <w:r>
-        <w:rPr>
-          <w:b w:val="1"/>
-          <w:bCs w:val="1"/>
-          <w:sz w:val="34"/>
-          <w:szCs w:val="34"/>
-          <w:rtl w:val="0"/>
-        </w:rPr>
-        <w:t xml:space="preserve">1. Purpose of This Framework</w:t>
-      </w:r>
-    </w:p>
-    <w:p>
-      <w:pPr>
-        <w:spacing w:after="240" w:before="240" w:lineRule="auto"/>
-        <w:rPr/>
-      </w:pPr>
-      <w:r>
-        <w:rPr>
-          <w:rtl w:val="0"/>
-        </w:rPr>
-        <w:t xml:space="preserve">The Opportunity Scoring System is a decision-making tool used to evaluate and rank business ideas.</w:t>
-      </w:r>
-    </w:p>
-    <w:p>
-      <w:pPr>
-        <w:spacing w:after="240" w:before="240" w:lineRule="auto"/>
-        <w:rPr/>
-      </w:pPr>
-      <w:r>
-        <w:rPr>
-          <w:rtl w:val="0"/>
-        </w:rPr>
-        <w:t xml:space="preserve">Its purpose is to reduce emotional decision-making and replace assumptions with structured analysis.</w:t>
-      </w:r>
-    </w:p>
-    <w:p>
-      <w:pPr>
-        <w:spacing w:after="240" w:before="240" w:lineRule="auto"/>
-        <w:rPr/>
-      </w:pPr>
-      <w:r>
-        <w:rPr>
-          <w:rtl w:val="0"/>
-        </w:rPr>
-        <w:t xml:space="preserve">Not every interesting idea is a good opportunity.</w:t>
-      </w:r>
-    </w:p>
-    <w:p>
-      <w:pPr>
-        <w:spacing w:after="240" w:before="240" w:lineRule="auto"/>
-        <w:rPr/>
-      </w:pPr>
-      <w:r>
-        <w:rPr>
-          <w:rtl w:val="0"/>
-        </w:rPr>
-        <w:t xml:space="preserve">A strong opportunity usually combines:</w:t>
-      </w:r>
-    </w:p>
-    <w:p>
-      <w:pPr>
-        <w:numPr>
-          <w:ilvl w:val="0"/>
-          <w:numId w:val="1"/>
-        </w:numPr>
-        <w:spacing w:after="0" w:afterAutospacing="0" w:before="240" w:lineRule="auto"/>
-        <w:ind w:left="720" w:hanging="360"/>
-      </w:pPr>
-      <w:r>
-        <w:rPr>
-          <w:rtl w:val="0"/>
-        </w:rPr>
-        <w:t xml:space="preserve">A real customer problem</w:t>
-      </w:r>
-    </w:p>
-    <w:p>
-      <w:pPr>
-        <w:numPr>
-          <w:ilvl w:val="0"/>
-          <w:numId w:val="1"/>
-        </w:numPr>
-        <w:spacing w:after="0" w:afterAutospacing="0" w:before="0" w:beforeAutospacing="0" w:lineRule="auto"/>
-        <w:ind w:left="720" w:hanging="360"/>
-      </w:pPr>
-      <w:r>
-        <w:rPr>
-          <w:rtl w:val="0"/>
-        </w:rPr>
-        <w:t xml:space="preserve">Strong demand</w:t>
-      </w:r>
-    </w:p>
-    <w:p>
-      <w:pPr>
-        <w:numPr>
-          <w:ilvl w:val="0"/>
-          <w:numId w:val="1"/>
-        </w:numPr>
-        <w:spacing w:after="0" w:afterAutospacing="0" w:before="0" w:beforeAutospacing="0" w:lineRule="auto"/>
-        <w:ind w:left="720" w:hanging="360"/>
-      </w:pPr>
-      <w:r>
-        <w:rPr>
-          <w:rtl w:val="0"/>
-        </w:rPr>
-        <w:t xml:space="preserve">A profitable business model</w:t>
-      </w:r>
-    </w:p>
-    <w:p>
-      <w:pPr>
-        <w:numPr>
-          <w:ilvl w:val="0"/>
-          <w:numId w:val="1"/>
-        </w:numPr>
-        <w:spacing w:after="0" w:afterAutospacing="0" w:before="0" w:beforeAutospacing="0" w:lineRule="auto"/>
-        <w:ind w:left="720" w:hanging="360"/>
-      </w:pPr>
-      <w:r>
-        <w:rPr>
-          <w:rtl w:val="0"/>
-        </w:rPr>
-        <w:t xml:space="preserve">A clear advantage</w:t>
-      </w:r>
-    </w:p>
-    <w:p>
-      <w:pPr>
-        <w:numPr>
-          <w:ilvl w:val="0"/>
-          <w:numId w:val="1"/>
-        </w:numPr>
-        <w:spacing w:after="240" w:before="0" w:beforeAutospacing="0" w:lineRule="auto"/>
-        <w:ind w:left="720" w:hanging="360"/>
-      </w:pPr>
-      <w:r>
-        <w:rPr>
-          <w:rtl w:val="0"/>
-        </w:rPr>
-        <w:t xml:space="preserve">The ability to execute</w:t>
-      </w:r>
-    </w:p>
-    <w:p>
-      <w:pPr>
-        <w:rPr/>
-      </w:pPr>
-      <w:r>
-        <w:pict>
-          <v:rect style="width:0.0pt;height:1.5pt" o:hr="t" o:hrstd="t" o:hralign="center" fillcolor="#A0A0A0" stroked="f"/>
-        </w:pict>
-      </w:r>
-      <w:r>
-        <w:rPr>
-          <w:rtl w:val="0"/>
-        </w:rPr>
-      </w:r>
-    </w:p>
-    <w:p>
-      <w:pPr>
-        <w:pStyle w:val="Heading1"/>
-        <w:keepNext w:val="0"/>
-        <w:keepLines w:val="0"/>
-        <w:spacing w:before="480" w:lineRule="auto"/>
-        <w:rPr>
-          <w:b w:val="1"/>
-          <w:bCs w:val="1"/>
-          <w:sz w:val="46"/>
-          <w:szCs w:val="46"/>
-        </w:rPr>
-      </w:pPr>
-      <w:bookmarkStart w:colFirst="0" w:colLast="0" w:name="_fm5yahg151qa" w:id="44"/>
-      <w:bookmarkEnd w:id="44"/>
-      <w:r>
-        <w:rPr>
-          <w:b w:val="1"/>
-          <w:bCs w:val="1"/>
-          <w:sz w:val="46"/>
-          <w:szCs w:val="46"/>
-          <w:rtl w:val="0"/>
-        </w:rPr>
-        <w:t xml:space="preserve">2. The Opportunity Score Formula</w:t>
-      </w:r>
-    </w:p>
-    <w:p>
-      <w:pPr>
-        <w:spacing w:after="240" w:before="240" w:lineRule="auto"/>
-        <w:rPr/>
-      </w:pPr>
-      <w:r>
-        <w:rPr>
-          <w:rtl w:val="0"/>
-        </w:rPr>
-        <w:t xml:space="preserve">Each business idea is evaluated across key categories.</w:t>
-      </w:r>
-    </w:p>
-    <w:p>
-      <w:pPr>
-        <w:spacing w:after="240" w:before="240" w:lineRule="auto"/>
-        <w:rPr/>
-      </w:pPr>
-      <w:r>
-        <w:rPr>
-          <w:rtl w:val="0"/>
-        </w:rPr>
-        <w:t xml:space="preserve">Score each category from:</w:t>
-      </w:r>
-    </w:p>
-    <w:p>
-      <w:pPr>
-        <w:spacing w:after="240" w:before="240" w:lineRule="auto"/>
-        <w:rPr/>
-      </w:pPr>
-      <w:r>
-        <w:rPr>
-          <w:rtl w:val="0"/>
-        </w:rPr>
-        <w:t xml:space="preserve">1 = Very Weak</w:t>
-      </w:r>
-    </w:p>
-    <w:p>
-      <w:pPr>
-        <w:spacing w:after="240" w:before="240" w:lineRule="auto"/>
-        <w:rPr/>
-      </w:pPr>
-      <w:r>
-        <w:rPr>
-          <w:rtl w:val="0"/>
-        </w:rPr>
-        <w:t xml:space="preserve">5 = Average</w:t>
-      </w:r>
-    </w:p>
-    <w:p>
-      <w:pPr>
-        <w:spacing w:after="240" w:before="240" w:lineRule="auto"/>
-        <w:rPr/>
-      </w:pPr>
-      <w:r>
-        <w:rPr>
-          <w:rtl w:val="0"/>
-        </w:rPr>
-        <w:t xml:space="preserve">10 = Excellent</w:t>
-      </w:r>
-    </w:p>
-    <w:p>
-      <w:pPr>
-        <w:spacing w:after="240" w:before="240" w:lineRule="auto"/>
-        <w:rPr/>
-      </w:pPr>
-      <w:r>
-        <w:rPr>
-          <w:rtl w:val="0"/>
-        </w:rPr>
-        <w:t xml:space="preserve">The total score helps determine whether an idea deserves further investigation.</w:t>
-      </w:r>
-    </w:p>
-    <w:p>
-      <w:pPr>
-        <w:rPr/>
-      </w:pPr>
-      <w:r>
-        <w:pict>
-          <v:rect style="width:0.0pt;height:1.5pt" o:hr="t" o:hrstd="t" o:hralign="center" fillcolor="#A0A0A0" stroked="f"/>
-        </w:pict>
-      </w:r>
-      <w:r>
-        <w:rPr>
-          <w:rtl w:val="0"/>
-        </w:rPr>
-      </w:r>
-    </w:p>
-    <w:p>
-      <w:pPr>
-        <w:pStyle w:val="Heading1"/>
-        <w:keepNext w:val="0"/>
-        <w:keepLines w:val="0"/>
-        <w:spacing w:before="480" w:lineRule="auto"/>
-        <w:rPr>
-          <w:b w:val="1"/>
-          <w:bCs w:val="1"/>
-          <w:sz w:val="46"/>
-          <w:szCs w:val="46"/>
-        </w:rPr>
-      </w:pPr>
-      <w:bookmarkStart w:colFirst="0" w:colLast="0" w:name="_616d9w44tgvi" w:id="45"/>
-      <w:bookmarkEnd w:id="45"/>
-      <w:r>
-        <w:rPr>
-          <w:b w:val="1"/>
-          <w:bCs w:val="1"/>
-          <w:sz w:val="46"/>
-          <w:szCs w:val="46"/>
-          <w:rtl w:val="0"/>
-        </w:rPr>
-        <w:t xml:space="preserve">3. Opportunity Evaluation Categories</w:t>
-      </w:r>
-    </w:p>
-    <w:p>
-      <w:pPr>
-        <w:pStyle w:val="Heading2"/>
-        <w:keepNext w:val="0"/>
-        <w:keepLines w:val="0"/>
-        <w:spacing w:after="80" w:lineRule="auto"/>
-        <w:rPr>
-          <w:b w:val="1"/>
-          <w:bCs w:val="1"/>
-          <w:sz w:val="34"/>
-          <w:szCs w:val="34"/>
-        </w:rPr>
-      </w:pPr>
-      <w:bookmarkStart w:colFirst="0" w:colLast="0" w:name="_r49inj87c3a8" w:id="46"/>
-      <w:bookmarkEnd w:id="46"/>
-      <w:r>
-        <w:rPr>
-          <w:b w:val="1"/>
-          <w:bCs w:val="1"/>
-          <w:sz w:val="34"/>
-          <w:szCs w:val="34"/>
-          <w:rtl w:val="0"/>
-        </w:rPr>
-        <w:t xml:space="preserve">1. Problem Strength</w:t>
-      </w:r>
-    </w:p>
-    <w:p>
-      <w:pPr>
-        <w:pStyle w:val="Heading3"/>
-        <w:keepNext w:val="0"/>
-        <w:keepLines w:val="0"/>
-        <w:spacing w:before="280" w:lineRule="auto"/>
-        <w:rPr>
-          <w:b w:val="1"/>
-          <w:bCs w:val="1"/>
-          <w:color w:val="000000"/>
-          <w:sz w:val="26"/>
-          <w:szCs w:val="26"/>
-        </w:rPr>
-      </w:pPr>
-      <w:bookmarkStart w:colFirst="0" w:colLast="0" w:name="_rf5xbia43kx6" w:id="47"/>
-      <w:bookmarkEnd w:id="47"/>
-      <w:r>
-        <w:rPr>
-          <w:b w:val="1"/>
-          <w:bCs w:val="1"/>
-          <w:color w:val="000000"/>
-          <w:sz w:val="26"/>
-          <w:szCs w:val="26"/>
-          <w:rtl w:val="0"/>
-        </w:rPr>
-        <w:t xml:space="preserve">Question:</w:t>
-      </w:r>
-    </w:p>
-    <w:p>
-      <w:pPr>
-        <w:spacing w:after="240" w:before="240" w:lineRule="auto"/>
-        <w:rPr/>
-      </w:pPr>
-      <w:r>
-        <w:rPr>
-          <w:rtl w:val="0"/>
-        </w:rPr>
-        <w:t xml:space="preserve">How important is the problem being solved?</w:t>
-      </w:r>
-    </w:p>
-    <w:p>
-      <w:pPr>
-        <w:spacing w:after="240" w:before="240" w:lineRule="auto"/>
-        <w:rPr/>
-      </w:pPr>
-      <w:r>
-        <w:rPr>
-          <w:rtl w:val="0"/>
-        </w:rPr>
-        <w:t xml:space="preserve">Evaluate:</w:t>
-      </w:r>
-    </w:p>
-    <w:p>
-      <w:pPr>
-        <w:numPr>
-          <w:ilvl w:val="0"/>
-          <w:numId w:val="11"/>
-        </w:numPr>
-        <w:spacing w:after="0" w:afterAutospacing="0" w:before="240" w:lineRule="auto"/>
-        <w:ind w:left="720" w:hanging="360"/>
-      </w:pPr>
-      <w:r>
-        <w:rPr>
-          <w:rtl w:val="0"/>
-        </w:rPr>
-        <w:t xml:space="preserve">How painful is the problem?</w:t>
-      </w:r>
-    </w:p>
-    <w:p>
-      <w:pPr>
-        <w:numPr>
-          <w:ilvl w:val="0"/>
-          <w:numId w:val="11"/>
-        </w:numPr>
-        <w:spacing w:after="0" w:afterAutospacing="0" w:before="0" w:beforeAutospacing="0" w:lineRule="auto"/>
-        <w:ind w:left="720" w:hanging="360"/>
-      </w:pPr>
-      <w:r>
-        <w:rPr>
-          <w:rtl w:val="0"/>
-        </w:rPr>
-        <w:t xml:space="preserve">How frequently does it occur?</w:t>
-      </w:r>
-    </w:p>
-    <w:p>
-      <w:pPr>
-        <w:numPr>
-          <w:ilvl w:val="0"/>
-          <w:numId w:val="11"/>
-        </w:numPr>
-        <w:spacing w:after="240" w:before="0" w:beforeAutospacing="0" w:lineRule="auto"/>
-        <w:ind w:left="720" w:hanging="360"/>
-      </w:pPr>
-      <w:r>
-        <w:rPr>
-          <w:rtl w:val="0"/>
-        </w:rPr>
-        <w:t xml:space="preserve">Are customers actively looking for solutions?</w:t>
-      </w:r>
-    </w:p>
-    <w:p>
-      <w:pPr>
-        <w:spacing w:after="240" w:before="240" w:lineRule="auto"/>
-        <w:rPr/>
-      </w:pPr>
-      <w:r>
-        <w:rPr>
-          <w:rtl w:val="0"/>
-        </w:rPr>
-        <w:t xml:space="preserve">Score:</w:t>
-      </w:r>
-    </w:p>
-    <w:p>
-      <w:pPr>
-        <w:spacing w:after="240" w:before="240" w:lineRule="auto"/>
-        <w:rPr/>
-      </w:pPr>
-      <w:r>
-        <w:rPr>
-          <w:rtl w:val="0"/>
-        </w:rPr>
-        <w:t xml:space="preserve">__/10</w:t>
-      </w:r>
-    </w:p>
-    <w:p>
-      <w:pPr>
-        <w:rPr/>
-      </w:pPr>
-      <w:r>
-        <w:pict>
-          <v:rect style="width:0.0pt;height:1.5pt" o:hr="t" o:hrstd="t" o:hralign="center" fillcolor="#A0A0A0" stroked="f"/>
-        </w:pict>
-      </w:r>
-      <w:r>
-        <w:rPr>
-          <w:rtl w:val="0"/>
-        </w:rPr>
-      </w:r>
-    </w:p>
-    <w:p>
-      <w:pPr>
-        <w:pStyle w:val="Heading2"/>
-        <w:keepNext w:val="0"/>
-        <w:keepLines w:val="0"/>
-        <w:spacing w:after="80" w:lineRule="auto"/>
-        <w:rPr>
-          <w:b w:val="1"/>
-          <w:bCs w:val="1"/>
-          <w:sz w:val="34"/>
-          <w:szCs w:val="34"/>
-        </w:rPr>
-      </w:pPr>
-      <w:bookmarkStart w:colFirst="0" w:colLast="0" w:name="_ndyej86c1jzz" w:id="48"/>
-      <w:bookmarkEnd w:id="48"/>
-      <w:r>
-        <w:rPr>
-          <w:b w:val="1"/>
-          <w:bCs w:val="1"/>
-          <w:sz w:val="34"/>
-          <w:szCs w:val="34"/>
-          <w:rtl w:val="0"/>
-        </w:rPr>
-        <w:t xml:space="preserve">2. Customer Demand</w:t>
-      </w:r>
-    </w:p>
-    <w:p>
-      <w:pPr>
-        <w:pStyle w:val="Heading3"/>
-        <w:keepNext w:val="0"/>
-        <w:keepLines w:val="0"/>
-        <w:spacing w:before="280" w:lineRule="auto"/>
-        <w:rPr>
-          <w:b w:val="1"/>
-          <w:bCs w:val="1"/>
-          <w:color w:val="000000"/>
-          <w:sz w:val="26"/>
-          <w:szCs w:val="26"/>
-        </w:rPr>
-      </w:pPr>
-      <w:bookmarkStart w:colFirst="0" w:colLast="0" w:name="_wlh89n36vaw5" w:id="49"/>
-      <w:bookmarkEnd w:id="49"/>
-      <w:r>
-        <w:rPr>
-          <w:b w:val="1"/>
-          <w:bCs w:val="1"/>
-          <w:color w:val="000000"/>
-          <w:sz w:val="26"/>
-          <w:szCs w:val="26"/>
-          <w:rtl w:val="0"/>
-        </w:rPr>
-        <w:t xml:space="preserve">Question:</w:t>
-      </w:r>
-    </w:p>
-    <w:p>
-      <w:pPr>
-        <w:spacing w:after="240" w:before="240" w:lineRule="auto"/>
-        <w:rPr/>
-      </w:pPr>
-      <w:r>
-        <w:rPr>
-          <w:rtl w:val="0"/>
-        </w:rPr>
-        <w:t xml:space="preserve">Do enough people want this solution?</w:t>
-      </w:r>
-    </w:p>
-    <w:p>
-      <w:pPr>
-        <w:spacing w:after="240" w:before="240" w:lineRule="auto"/>
-        <w:rPr/>
-      </w:pPr>
-      <w:r>
-        <w:rPr>
-          <w:rtl w:val="0"/>
-        </w:rPr>
-        <w:t xml:space="preserve">Evaluate:</w:t>
-      </w:r>
-    </w:p>
-    <w:p>
-      <w:pPr>
-        <w:numPr>
-          <w:ilvl w:val="0"/>
-          <w:numId w:val="17"/>
-        </w:numPr>
-        <w:spacing w:after="0" w:afterAutospacing="0" w:before="240" w:lineRule="auto"/>
-        <w:ind w:left="720" w:hanging="360"/>
-      </w:pPr>
-      <w:r>
-        <w:rPr>
-          <w:rtl w:val="0"/>
-        </w:rPr>
-        <w:t xml:space="preserve">Customer interest</w:t>
-      </w:r>
-    </w:p>
-    <w:p>
-      <w:pPr>
-        <w:numPr>
-          <w:ilvl w:val="0"/>
-          <w:numId w:val="17"/>
-        </w:numPr>
-        <w:spacing w:after="0" w:afterAutospacing="0" w:before="0" w:beforeAutospacing="0" w:lineRule="auto"/>
-        <w:ind w:left="720" w:hanging="360"/>
-      </w:pPr>
-      <w:r>
-        <w:rPr>
-          <w:rtl w:val="0"/>
-        </w:rPr>
-        <w:t xml:space="preserve">Existing demand</w:t>
-      </w:r>
-    </w:p>
-    <w:p>
-      <w:pPr>
-        <w:numPr>
-          <w:ilvl w:val="0"/>
-          <w:numId w:val="17"/>
-        </w:numPr>
-        <w:spacing w:after="0" w:afterAutospacing="0" w:before="0" w:beforeAutospacing="0" w:lineRule="auto"/>
-        <w:ind w:left="720" w:hanging="360"/>
-      </w:pPr>
-      <w:r>
-        <w:rPr>
-          <w:rtl w:val="0"/>
-        </w:rPr>
-        <w:t xml:space="preserve">Search trends</w:t>
-      </w:r>
-    </w:p>
-    <w:p>
-      <w:pPr>
-        <w:numPr>
-          <w:ilvl w:val="0"/>
-          <w:numId w:val="17"/>
-        </w:numPr>
-        <w:spacing w:after="0" w:afterAutospacing="0" w:before="0" w:beforeAutospacing="0" w:lineRule="auto"/>
-        <w:ind w:left="720" w:hanging="360"/>
-      </w:pPr>
-      <w:r>
-        <w:rPr>
-          <w:rtl w:val="0"/>
-        </w:rPr>
-        <w:t xml:space="preserve">Buying behaviour</w:t>
-      </w:r>
-    </w:p>
-    <w:p>
-      <w:pPr>
-        <w:numPr>
-          <w:ilvl w:val="0"/>
-          <w:numId w:val="17"/>
-        </w:numPr>
-        <w:spacing w:after="240" w:before="0" w:beforeAutospacing="0" w:lineRule="auto"/>
-        <w:ind w:left="720" w:hanging="360"/>
-      </w:pPr>
-      <w:r>
-        <w:rPr>
-          <w:rtl w:val="0"/>
-        </w:rPr>
-        <w:t xml:space="preserve">Market validation</w:t>
-      </w:r>
-    </w:p>
-    <w:p>
-      <w:pPr>
-        <w:spacing w:after="240" w:before="240" w:lineRule="auto"/>
-        <w:rPr/>
-      </w:pPr>
-      <w:r>
-        <w:rPr>
-          <w:rtl w:val="0"/>
-        </w:rPr>
-        <w:t xml:space="preserve">Score:</w:t>
-      </w:r>
-    </w:p>
-    <w:p>
-      <w:pPr>
-        <w:spacing w:after="240" w:before="240" w:lineRule="auto"/>
-        <w:rPr/>
-      </w:pPr>
-      <w:r>
-        <w:rPr>
-          <w:rtl w:val="0"/>
-        </w:rPr>
-        <w:t xml:space="preserve">__/10</w:t>
-      </w:r>
-    </w:p>
-    <w:p>
-      <w:pPr>
-        <w:rPr/>
-      </w:pPr>
-      <w:r>
-        <w:pict>
-          <v:rect style="width:0.0pt;height:1.5pt" o:hr="t" o:hrstd="t" o:hralign="center" fillcolor="#A0A0A0" stroked="f"/>
-        </w:pict>
-      </w:r>
-      <w:r>
-        <w:rPr>
-          <w:rtl w:val="0"/>
-        </w:rPr>
-      </w:r>
-    </w:p>
-    <w:p>
-      <w:pPr>
-        <w:pStyle w:val="Heading2"/>
-        <w:keepNext w:val="0"/>
-        <w:keepLines w:val="0"/>
-        <w:spacing w:after="80" w:lineRule="auto"/>
-        <w:rPr>
-          <w:b w:val="1"/>
-          <w:bCs w:val="1"/>
-          <w:sz w:val="34"/>
-          <w:szCs w:val="34"/>
-        </w:rPr>
-      </w:pPr>
-      <w:bookmarkStart w:colFirst="0" w:colLast="0" w:name="_hueo5j31a9nw" w:id="50"/>
-      <w:bookmarkEnd w:id="50"/>
-      <w:r>
-        <w:rPr>
-          <w:b w:val="1"/>
-          <w:bCs w:val="1"/>
-          <w:sz w:val="34"/>
-          <w:szCs w:val="34"/>
-          <w:rtl w:val="0"/>
-        </w:rPr>
-        <w:t xml:space="preserve">3. Market Opportunity</w:t>
-      </w:r>
-    </w:p>
-    <w:p>
-      <w:pPr>
-        <w:pStyle w:val="Heading3"/>
-        <w:keepNext w:val="0"/>
-        <w:keepLines w:val="0"/>
-        <w:spacing w:before="280" w:lineRule="auto"/>
-        <w:rPr>
-          <w:b w:val="1"/>
-          <w:bCs w:val="1"/>
-          <w:color w:val="000000"/>
-          <w:sz w:val="26"/>
-          <w:szCs w:val="26"/>
-        </w:rPr>
-      </w:pPr>
-      <w:bookmarkStart w:colFirst="0" w:colLast="0" w:name="_a8k8u968t03s" w:id="51"/>
-      <w:bookmarkEnd w:id="51"/>
-      <w:r>
-        <w:rPr>
-          <w:b w:val="1"/>
-          <w:bCs w:val="1"/>
-          <w:color w:val="000000"/>
-          <w:sz w:val="26"/>
-          <w:szCs w:val="26"/>
-          <w:rtl w:val="0"/>
-        </w:rPr>
-        <w:t xml:space="preserve">Question:</w:t>
-      </w:r>
-    </w:p>
-    <w:p>
-      <w:pPr>
-        <w:spacing w:after="240" w:before="240" w:lineRule="auto"/>
-        <w:rPr/>
-      </w:pPr>
-      <w:r>
-        <w:rPr>
-          <w:rtl w:val="0"/>
-        </w:rPr>
-        <w:t xml:space="preserve">Is the market large and growing?</w:t>
-      </w:r>
-    </w:p>
-    <w:p>
-      <w:pPr>
-        <w:spacing w:after="240" w:before="240" w:lineRule="auto"/>
-        <w:rPr/>
-      </w:pPr>
-      <w:r>
-        <w:rPr>
-          <w:rtl w:val="0"/>
-        </w:rPr>
-        <w:t xml:space="preserve">Evaluate:</w:t>
-      </w:r>
-    </w:p>
-    <w:p>
-      <w:pPr>
-        <w:numPr>
-          <w:ilvl w:val="0"/>
-          <w:numId w:val="4"/>
-        </w:numPr>
-        <w:spacing w:after="0" w:afterAutospacing="0" w:before="240" w:lineRule="auto"/>
-        <w:ind w:left="720" w:hanging="360"/>
-      </w:pPr>
-      <w:r>
-        <w:rPr>
-          <w:rtl w:val="0"/>
-        </w:rPr>
-        <w:t xml:space="preserve">Market size</w:t>
-      </w:r>
-    </w:p>
-    <w:p>
-      <w:pPr>
-        <w:numPr>
-          <w:ilvl w:val="0"/>
-          <w:numId w:val="4"/>
-        </w:numPr>
-        <w:spacing w:after="0" w:afterAutospacing="0" w:before="0" w:beforeAutospacing="0" w:lineRule="auto"/>
-        <w:ind w:left="720" w:hanging="360"/>
-      </w:pPr>
-      <w:r>
-        <w:rPr>
-          <w:rtl w:val="0"/>
-        </w:rPr>
-        <w:t xml:space="preserve">Growth trends</w:t>
-      </w:r>
-    </w:p>
-    <w:p>
-      <w:pPr>
-        <w:numPr>
-          <w:ilvl w:val="0"/>
-          <w:numId w:val="4"/>
-        </w:numPr>
-        <w:spacing w:after="0" w:afterAutospacing="0" w:before="0" w:beforeAutospacing="0" w:lineRule="auto"/>
-        <w:ind w:left="720" w:hanging="360"/>
-      </w:pPr>
-      <w:r>
-        <w:rPr>
-          <w:rtl w:val="0"/>
-        </w:rPr>
-        <w:t xml:space="preserve">Future potential</w:t>
-      </w:r>
-    </w:p>
-    <w:p>
-      <w:pPr>
-        <w:numPr>
-          <w:ilvl w:val="0"/>
-          <w:numId w:val="4"/>
-        </w:numPr>
-        <w:spacing w:after="240" w:before="0" w:beforeAutospacing="0" w:lineRule="auto"/>
-        <w:ind w:left="720" w:hanging="360"/>
-      </w:pPr>
-      <w:r>
-        <w:rPr>
-          <w:rtl w:val="0"/>
-        </w:rPr>
-        <w:t xml:space="preserve">Industry changes</w:t>
-      </w:r>
-    </w:p>
-    <w:p>
-      <w:pPr>
-        <w:spacing w:after="240" w:before="240" w:lineRule="auto"/>
-        <w:rPr/>
-      </w:pPr>
-      <w:r>
-        <w:rPr>
-          <w:rtl w:val="0"/>
-        </w:rPr>
-        <w:t xml:space="preserve">Score:</w:t>
-      </w:r>
-    </w:p>
-    <w:p>
-      <w:pPr>
-        <w:spacing w:after="240" w:before="240" w:lineRule="auto"/>
-        <w:rPr/>
-      </w:pPr>
-      <w:r>
-        <w:rPr>
-          <w:rtl w:val="0"/>
-        </w:rPr>
-        <w:t xml:space="preserve">__/10</w:t>
-      </w:r>
-    </w:p>
-    <w:p>
-      <w:pPr>
-        <w:rPr/>
-      </w:pPr>
-      <w:r>
-        <w:pict>
-          <v:rect style="width:0.0pt;height:1.5pt" o:hr="t" o:hrstd="t" o:hralign="center" fillcolor="#A0A0A0" stroked="f"/>
-        </w:pict>
-      </w:r>
-      <w:r>
-        <w:rPr>
-          <w:rtl w:val="0"/>
-        </w:rPr>
-      </w:r>
-    </w:p>
-    <w:p>
-      <w:pPr>
-        <w:pStyle w:val="Heading2"/>
-        <w:keepNext w:val="0"/>
-        <w:keepLines w:val="0"/>
-        <w:spacing w:after="80" w:lineRule="auto"/>
-        <w:rPr>
-          <w:b w:val="1"/>
-          <w:bCs w:val="1"/>
-          <w:sz w:val="34"/>
-          <w:szCs w:val="34"/>
-        </w:rPr>
-      </w:pPr>
-      <w:bookmarkStart w:colFirst="0" w:colLast="0" w:name="_jn26ec2lkgu4" w:id="52"/>
-      <w:bookmarkEnd w:id="52"/>
-      <w:r>
-        <w:rPr>
-          <w:b w:val="1"/>
-          <w:bCs w:val="1"/>
-          <w:sz w:val="34"/>
-          <w:szCs w:val="34"/>
-          <w:rtl w:val="0"/>
-        </w:rPr>
-        <w:t xml:space="preserve">4. Business Model Potential</w:t>
-      </w:r>
-    </w:p>
-    <w:p>
-      <w:pPr>
-        <w:pStyle w:val="Heading3"/>
-        <w:keepNext w:val="0"/>
-        <w:keepLines w:val="0"/>
-        <w:spacing w:before="280" w:lineRule="auto"/>
-        <w:rPr>
-          <w:b w:val="1"/>
-          <w:bCs w:val="1"/>
-          <w:color w:val="000000"/>
-          <w:sz w:val="26"/>
-          <w:szCs w:val="26"/>
-        </w:rPr>
-      </w:pPr>
-      <w:bookmarkStart w:colFirst="0" w:colLast="0" w:name="_jy0mj7biw0fm" w:id="53"/>
-      <w:bookmarkEnd w:id="53"/>
-      <w:r>
-        <w:rPr>
-          <w:b w:val="1"/>
-          <w:bCs w:val="1"/>
-          <w:color w:val="000000"/>
-          <w:sz w:val="26"/>
-          <w:szCs w:val="26"/>
-          <w:rtl w:val="0"/>
-        </w:rPr>
-        <w:t xml:space="preserve">Question:</w:t>
-      </w:r>
-    </w:p>
-    <w:p>
-      <w:pPr>
-        <w:spacing w:after="240" w:before="240" w:lineRule="auto"/>
-        <w:rPr/>
-      </w:pPr>
-      <w:r>
-        <w:rPr>
-          <w:rtl w:val="0"/>
-        </w:rPr>
-        <w:t xml:space="preserve">Can this become a profitable business?</w:t>
-      </w:r>
-    </w:p>
-    <w:p>
-      <w:pPr>
-        <w:spacing w:after="240" w:before="240" w:lineRule="auto"/>
-        <w:rPr/>
-      </w:pPr>
-      <w:r>
-        <w:rPr>
-          <w:rtl w:val="0"/>
-        </w:rPr>
-        <w:t xml:space="preserve">Evaluate:</w:t>
-      </w:r>
-    </w:p>
-    <w:p>
-      <w:pPr>
-        <w:numPr>
-          <w:ilvl w:val="0"/>
-          <w:numId w:val="10"/>
-        </w:numPr>
-        <w:spacing w:after="0" w:afterAutospacing="0" w:before="240" w:lineRule="auto"/>
-        <w:ind w:left="720" w:hanging="360"/>
-      </w:pPr>
-      <w:r>
-        <w:rPr>
-          <w:rtl w:val="0"/>
-        </w:rPr>
-        <w:t xml:space="preserve">Revenue opportunities</w:t>
-      </w:r>
-    </w:p>
-    <w:p>
-      <w:pPr>
-        <w:numPr>
-          <w:ilvl w:val="0"/>
-          <w:numId w:val="10"/>
-        </w:numPr>
-        <w:spacing w:after="0" w:afterAutospacing="0" w:before="0" w:beforeAutospacing="0" w:lineRule="auto"/>
-        <w:ind w:left="720" w:hanging="360"/>
-      </w:pPr>
-      <w:r>
-        <w:rPr>
-          <w:rtl w:val="0"/>
-        </w:rPr>
-        <w:t xml:space="preserve">Pricing potential</w:t>
-      </w:r>
-    </w:p>
-    <w:p>
-      <w:pPr>
-        <w:numPr>
-          <w:ilvl w:val="0"/>
-          <w:numId w:val="10"/>
-        </w:numPr>
-        <w:spacing w:after="0" w:afterAutospacing="0" w:before="0" w:beforeAutospacing="0" w:lineRule="auto"/>
-        <w:ind w:left="720" w:hanging="360"/>
-      </w:pPr>
-      <w:r>
-        <w:rPr>
-          <w:rtl w:val="0"/>
-        </w:rPr>
-        <w:t xml:space="preserve">Profit margins</w:t>
-      </w:r>
-    </w:p>
-    <w:p>
-      <w:pPr>
-        <w:numPr>
-          <w:ilvl w:val="0"/>
-          <w:numId w:val="10"/>
-        </w:numPr>
-        <w:spacing w:after="0" w:afterAutospacing="0" w:before="0" w:beforeAutospacing="0" w:lineRule="auto"/>
-        <w:ind w:left="720" w:hanging="360"/>
-      </w:pPr>
-      <w:r>
-        <w:rPr>
-          <w:rtl w:val="0"/>
-        </w:rPr>
-        <w:t xml:space="preserve">Repeat purchases</w:t>
-      </w:r>
-    </w:p>
-    <w:p>
-      <w:pPr>
-        <w:numPr>
-          <w:ilvl w:val="0"/>
-          <w:numId w:val="10"/>
-        </w:numPr>
-        <w:spacing w:after="240" w:before="0" w:beforeAutospacing="0" w:lineRule="auto"/>
-        <w:ind w:left="720" w:hanging="360"/>
-      </w:pPr>
-      <w:r>
-        <w:rPr>
-          <w:rtl w:val="0"/>
-        </w:rPr>
-        <w:t xml:space="preserve">Scalability</w:t>
-      </w:r>
-    </w:p>
-    <w:p>
-      <w:pPr>
-        <w:spacing w:after="240" w:before="240" w:lineRule="auto"/>
-        <w:rPr/>
-      </w:pPr>
-      <w:r>
-        <w:rPr>
-          <w:rtl w:val="0"/>
-        </w:rPr>
-        <w:t xml:space="preserve">Score:</w:t>
-      </w:r>
-    </w:p>
-    <w:p>
-      <w:pPr>
-        <w:spacing w:after="240" w:before="240" w:lineRule="auto"/>
-        <w:rPr/>
-      </w:pPr>
-      <w:r>
-        <w:rPr>
-          <w:rtl w:val="0"/>
-        </w:rPr>
-        <w:t xml:space="preserve">__/10</w:t>
-      </w:r>
-    </w:p>
-    <w:p>
-      <w:pPr>
-        <w:rPr/>
-      </w:pPr>
-      <w:r>
-        <w:pict>
-          <v:rect style="width:0.0pt;height:1.5pt" o:hr="t" o:hrstd="t" o:hralign="center" fillcolor="#A0A0A0" stroked="f"/>
-        </w:pict>
-      </w:r>
-      <w:r>
-        <w:rPr>
-          <w:rtl w:val="0"/>
-        </w:rPr>
-      </w:r>
-    </w:p>
-    <w:p>
-      <w:pPr>
-        <w:pStyle w:val="Heading2"/>
-        <w:keepNext w:val="0"/>
-        <w:keepLines w:val="0"/>
-        <w:spacing w:after="80" w:lineRule="auto"/>
-        <w:rPr>
-          <w:b w:val="1"/>
-          <w:bCs w:val="1"/>
-          <w:sz w:val="34"/>
-          <w:szCs w:val="34"/>
-        </w:rPr>
-      </w:pPr>
-      <w:bookmarkStart w:colFirst="0" w:colLast="0" w:name="_l71wimz69wrn" w:id="54"/>
-      <w:bookmarkEnd w:id="54"/>
-      <w:r>
-        <w:rPr>
-          <w:b w:val="1"/>
-          <w:bCs w:val="1"/>
-          <w:sz w:val="34"/>
-          <w:szCs w:val="34"/>
-          <w:rtl w:val="0"/>
-        </w:rPr>
-        <w:t xml:space="preserve">5. Competitive Advantage</w:t>
-      </w:r>
-    </w:p>
-    <w:p>
-      <w:pPr>
-        <w:pStyle w:val="Heading3"/>
-        <w:keepNext w:val="0"/>
-        <w:keepLines w:val="0"/>
-        <w:spacing w:before="280" w:lineRule="auto"/>
-        <w:rPr>
-          <w:b w:val="1"/>
-          <w:bCs w:val="1"/>
-          <w:color w:val="000000"/>
-          <w:sz w:val="26"/>
-          <w:szCs w:val="26"/>
-        </w:rPr>
-      </w:pPr>
-      <w:bookmarkStart w:colFirst="0" w:colLast="0" w:name="_m051nxtb945f" w:id="55"/>
-      <w:bookmarkEnd w:id="55"/>
-      <w:r>
-        <w:rPr>
-          <w:b w:val="1"/>
-          <w:bCs w:val="1"/>
-          <w:color w:val="000000"/>
-          <w:sz w:val="26"/>
-          <w:szCs w:val="26"/>
-          <w:rtl w:val="0"/>
-        </w:rPr>
-        <w:t xml:space="preserve">Question:</w:t>
-      </w:r>
-    </w:p>
-    <w:p>
-      <w:pPr>
-        <w:spacing w:after="240" w:before="240" w:lineRule="auto"/>
-        <w:rPr/>
-      </w:pPr>
-      <w:r>
-        <w:rPr>
-          <w:rtl w:val="0"/>
-        </w:rPr>
-        <w:t xml:space="preserve">Why would customers choose this over alternatives?</w:t>
-      </w:r>
-    </w:p>
-    <w:p>
-      <w:pPr>
-        <w:spacing w:after="240" w:before="240" w:lineRule="auto"/>
-        <w:rPr/>
-      </w:pPr>
-      <w:r>
-        <w:rPr>
-          <w:rtl w:val="0"/>
-        </w:rPr>
-        <w:t xml:space="preserve">Evaluate:</w:t>
-      </w:r>
-    </w:p>
-    <w:p>
-      <w:pPr>
-        <w:numPr>
-          <w:ilvl w:val="0"/>
-          <w:numId w:val="29"/>
-        </w:numPr>
-        <w:spacing w:after="0" w:afterAutospacing="0" w:before="240" w:lineRule="auto"/>
-        <w:ind w:left="720" w:hanging="360"/>
-      </w:pPr>
-      <w:r>
-        <w:rPr>
-          <w:rtl w:val="0"/>
-        </w:rPr>
-        <w:t xml:space="preserve">Differentiation</w:t>
-      </w:r>
-    </w:p>
-    <w:p>
-      <w:pPr>
-        <w:numPr>
-          <w:ilvl w:val="0"/>
-          <w:numId w:val="29"/>
-        </w:numPr>
-        <w:spacing w:after="0" w:afterAutospacing="0" w:before="0" w:beforeAutospacing="0" w:lineRule="auto"/>
-        <w:ind w:left="720" w:hanging="360"/>
-      </w:pPr>
-      <w:r>
-        <w:rPr>
-          <w:rtl w:val="0"/>
-        </w:rPr>
-        <w:t xml:space="preserve">Brand potential</w:t>
-      </w:r>
-    </w:p>
-    <w:p>
-      <w:pPr>
-        <w:numPr>
-          <w:ilvl w:val="0"/>
-          <w:numId w:val="29"/>
-        </w:numPr>
-        <w:spacing w:after="0" w:afterAutospacing="0" w:before="0" w:beforeAutospacing="0" w:lineRule="auto"/>
-        <w:ind w:left="720" w:hanging="360"/>
-      </w:pPr>
-      <w:r>
-        <w:rPr>
-          <w:rtl w:val="0"/>
-        </w:rPr>
-        <w:t xml:space="preserve">Unique assets</w:t>
-      </w:r>
-    </w:p>
-    <w:p>
-      <w:pPr>
-        <w:numPr>
-          <w:ilvl w:val="0"/>
-          <w:numId w:val="29"/>
-        </w:numPr>
-        <w:spacing w:after="240" w:before="0" w:beforeAutospacing="0" w:lineRule="auto"/>
-        <w:ind w:left="720" w:hanging="360"/>
-      </w:pPr>
-      <w:r>
-        <w:rPr>
-          <w:rtl w:val="0"/>
-        </w:rPr>
-        <w:t xml:space="preserve">Customer experience</w:t>
-      </w:r>
-    </w:p>
-    <w:p>
-      <w:pPr>
-        <w:spacing w:after="240" w:before="240" w:lineRule="auto"/>
-        <w:rPr/>
-      </w:pPr>
-      <w:r>
-        <w:rPr>
-          <w:rtl w:val="0"/>
-        </w:rPr>
-        <w:t xml:space="preserve">Score:</w:t>
-      </w:r>
-    </w:p>
-    <w:p>
-      <w:pPr>
-        <w:spacing w:after="240" w:before="240" w:lineRule="auto"/>
-        <w:rPr/>
-      </w:pPr>
-      <w:r>
-        <w:rPr>
-          <w:rtl w:val="0"/>
-        </w:rPr>
-        <w:t xml:space="preserve">__/10</w:t>
-      </w:r>
-    </w:p>
-    <w:p>
-      <w:pPr>
-        <w:pStyle w:val="Heading1"/>
-        <w:keepNext w:val="0"/>
-        <w:keepLines w:val="0"/>
-        <w:spacing w:before="480" w:lineRule="auto"/>
-        <w:rPr>
-          <w:b w:val="1"/>
-          <w:bCs w:val="1"/>
-          <w:sz w:val="46"/>
-          <w:szCs w:val="46"/>
-        </w:rPr>
-      </w:pPr>
-      <w:bookmarkStart w:colFirst="0" w:colLast="0" w:name="_dxt4w5t3zqs3" w:id="56"/>
-      <w:bookmarkEnd w:id="56"/>
-      <w:r>
-        <w:rPr>
-          <w:b w:val="1"/>
-          <w:bCs w:val="1"/>
-          <w:sz w:val="46"/>
-          <w:szCs w:val="46"/>
-          <w:rtl w:val="0"/>
-        </w:rPr>
-        <w:t xml:space="preserve">6. Execution Feasibility</w:t>
-      </w:r>
-    </w:p>
-    <w:p>
-      <w:pPr>
-        <w:pStyle w:val="Heading2"/>
-        <w:keepNext w:val="0"/>
-        <w:keepLines w:val="0"/>
-        <w:spacing w:after="80" w:lineRule="auto"/>
-        <w:rPr>
-          <w:b w:val="1"/>
-          <w:bCs w:val="1"/>
-          <w:sz w:val="34"/>
-          <w:szCs w:val="34"/>
-        </w:rPr>
-      </w:pPr>
-      <w:bookmarkStart w:colFirst="0" w:colLast="0" w:name="_q9qz1y8mn0hw" w:id="57"/>
-      <w:bookmarkEnd w:id="57"/>
-      <w:r>
-        <w:rPr>
-          <w:b w:val="1"/>
-          <w:bCs w:val="1"/>
-          <w:sz w:val="34"/>
-          <w:szCs w:val="34"/>
-          <w:rtl w:val="0"/>
-        </w:rPr>
-        <w:t xml:space="preserve">Question:</w:t>
-      </w:r>
-    </w:p>
-    <w:p>
-      <w:pPr>
-        <w:spacing w:after="240" w:before="240" w:lineRule="auto"/>
-        <w:rPr/>
-      </w:pPr>
-      <w:r>
-        <w:rPr>
-          <w:rtl w:val="0"/>
-        </w:rPr>
-        <w:t xml:space="preserve">Can this idea realistically be built and operated?</w:t>
-      </w:r>
-    </w:p>
-    <w:p>
-      <w:pPr>
-        <w:spacing w:after="240" w:before="240" w:lineRule="auto"/>
-        <w:rPr/>
-      </w:pPr>
-      <w:r>
-        <w:rPr>
-          <w:rtl w:val="0"/>
-        </w:rPr>
-        <w:t xml:space="preserve">A great opportunity must not only be desirable. It must also be achievable.</w:t>
-      </w:r>
-    </w:p>
-    <w:p>
-      <w:pPr>
-        <w:spacing w:after="240" w:before="240" w:lineRule="auto"/>
-        <w:rPr/>
-      </w:pPr>
-      <w:r>
-        <w:rPr>
-          <w:rtl w:val="0"/>
-        </w:rPr>
-        <w:t xml:space="preserve">Evaluate:</w:t>
-      </w:r>
-    </w:p>
-    <w:p>
-      <w:pPr>
-        <w:numPr>
-          <w:ilvl w:val="0"/>
-          <w:numId w:val="16"/>
-        </w:numPr>
-        <w:spacing w:after="0" w:afterAutospacing="0" w:before="240" w:lineRule="auto"/>
-        <w:ind w:left="720" w:hanging="360"/>
-      </w:pPr>
-      <w:r>
-        <w:rPr>
-          <w:rtl w:val="0"/>
-        </w:rPr>
-        <w:t xml:space="preserve">Startup costs</w:t>
-      </w:r>
-    </w:p>
-    <w:p>
-      <w:pPr>
-        <w:numPr>
-          <w:ilvl w:val="0"/>
-          <w:numId w:val="16"/>
-        </w:numPr>
-        <w:spacing w:after="0" w:afterAutospacing="0" w:before="0" w:beforeAutospacing="0" w:lineRule="auto"/>
-        <w:ind w:left="720" w:hanging="360"/>
-      </w:pPr>
-      <w:r>
-        <w:rPr>
-          <w:rtl w:val="0"/>
-        </w:rPr>
-        <w:t xml:space="preserve">Required skills</w:t>
-      </w:r>
-    </w:p>
-    <w:p>
-      <w:pPr>
-        <w:numPr>
-          <w:ilvl w:val="0"/>
-          <w:numId w:val="16"/>
-        </w:numPr>
-        <w:spacing w:after="0" w:afterAutospacing="0" w:before="0" w:beforeAutospacing="0" w:lineRule="auto"/>
-        <w:ind w:left="720" w:hanging="360"/>
-      </w:pPr>
-      <w:r>
-        <w:rPr>
-          <w:rtl w:val="0"/>
-        </w:rPr>
-        <w:t xml:space="preserve">Resources needed</w:t>
-      </w:r>
-    </w:p>
-    <w:p>
-      <w:pPr>
-        <w:numPr>
-          <w:ilvl w:val="0"/>
-          <w:numId w:val="16"/>
-        </w:numPr>
-        <w:spacing w:after="0" w:afterAutospacing="0" w:before="0" w:beforeAutospacing="0" w:lineRule="auto"/>
-        <w:ind w:left="720" w:hanging="360"/>
-      </w:pPr>
-      <w:r>
-        <w:rPr>
-          <w:rtl w:val="0"/>
-        </w:rPr>
-        <w:t xml:space="preserve">Time to launch</w:t>
-      </w:r>
-    </w:p>
-    <w:p>
-      <w:pPr>
-        <w:numPr>
-          <w:ilvl w:val="0"/>
-          <w:numId w:val="16"/>
-        </w:numPr>
-        <w:spacing w:after="0" w:afterAutospacing="0" w:before="0" w:beforeAutospacing="0" w:lineRule="auto"/>
-        <w:ind w:left="720" w:hanging="360"/>
-      </w:pPr>
-      <w:r>
-        <w:rPr>
-          <w:rtl w:val="0"/>
-        </w:rPr>
-        <w:t xml:space="preserve">Operational complexity</w:t>
-      </w:r>
-    </w:p>
-    <w:p>
-      <w:pPr>
-        <w:numPr>
-          <w:ilvl w:val="0"/>
-          <w:numId w:val="16"/>
-        </w:numPr>
-        <w:spacing w:after="0" w:afterAutospacing="0" w:before="0" w:beforeAutospacing="0" w:lineRule="auto"/>
-        <w:ind w:left="720" w:hanging="360"/>
-      </w:pPr>
-      <w:r>
-        <w:rPr>
-          <w:rtl w:val="0"/>
-        </w:rPr>
-        <w:t xml:space="preserve">Legal requirements</w:t>
-      </w:r>
-    </w:p>
-    <w:p>
-      <w:pPr>
-        <w:numPr>
-          <w:ilvl w:val="0"/>
-          <w:numId w:val="16"/>
-        </w:numPr>
-        <w:spacing w:after="240" w:before="0" w:beforeAutospacing="0" w:lineRule="auto"/>
-        <w:ind w:left="720" w:hanging="360"/>
-      </w:pPr>
-      <w:r>
-        <w:rPr>
-          <w:rtl w:val="0"/>
-        </w:rPr>
-        <w:t xml:space="preserve">Ability to scale</w:t>
-      </w:r>
-    </w:p>
-    <w:p>
-      <w:pPr>
-        <w:spacing w:after="240" w:before="240" w:lineRule="auto"/>
-        <w:rPr/>
-      </w:pPr>
-      <w:r>
-        <w:rPr>
-          <w:rtl w:val="0"/>
-        </w:rPr>
-        <w:t xml:space="preserve">Score:</w:t>
-      </w:r>
-    </w:p>
-    <w:p>
-      <w:pPr>
-        <w:spacing w:after="240" w:before="240" w:lineRule="auto"/>
-        <w:rPr/>
-      </w:pPr>
-      <w:r>
-        <w:rPr>
-          <w:rtl w:val="0"/>
-        </w:rPr>
-        <w:t xml:space="preserve">__/10</w:t>
-      </w:r>
-    </w:p>
-    <w:p>
-      <w:pPr>
-        <w:rPr/>
-      </w:pPr>
-      <w:r>
-        <w:pict>
-          <v:rect style="width:0.0pt;height:1.5pt" o:hr="t" o:hrstd="t" o:hralign="center" fillcolor="#A0A0A0" stroked="f"/>
-        </w:pict>
-      </w:r>
-      <w:r>
-        <w:rPr>
-          <w:rtl w:val="0"/>
-        </w:rPr>
-      </w:r>
-    </w:p>
-    <w:p>
-      <w:pPr>
-        <w:pStyle w:val="Heading1"/>
-        <w:keepNext w:val="0"/>
-        <w:keepLines w:val="0"/>
-        <w:spacing w:before="480" w:lineRule="auto"/>
-        <w:rPr>
-          <w:b w:val="1"/>
-          <w:bCs w:val="1"/>
-          <w:sz w:val="46"/>
-          <w:szCs w:val="46"/>
-        </w:rPr>
-      </w:pPr>
-      <w:bookmarkStart w:colFirst="0" w:colLast="0" w:name="_m8135gho5at7" w:id="58"/>
-      <w:bookmarkEnd w:id="58"/>
-      <w:r>
-        <w:rPr>
-          <w:b w:val="1"/>
-          <w:bCs w:val="1"/>
-          <w:sz w:val="46"/>
-          <w:szCs w:val="46"/>
-          <w:rtl w:val="0"/>
-        </w:rPr>
-        <w:t xml:space="preserve">7. Founder Advantage</w:t>
-      </w:r>
-    </w:p>
-    <w:p>
-      <w:pPr>
-        <w:pStyle w:val="Heading2"/>
-        <w:keepNext w:val="0"/>
-        <w:keepLines w:val="0"/>
-        <w:spacing w:after="80" w:lineRule="auto"/>
-        <w:rPr>
-          <w:b w:val="1"/>
-          <w:bCs w:val="1"/>
-          <w:sz w:val="34"/>
-          <w:szCs w:val="34"/>
-        </w:rPr>
-      </w:pPr>
-      <w:bookmarkStart w:colFirst="0" w:colLast="0" w:name="_uu6lfu669hd1" w:id="59"/>
-      <w:bookmarkEnd w:id="59"/>
-      <w:r>
-        <w:rPr>
-          <w:b w:val="1"/>
-          <w:bCs w:val="1"/>
-          <w:sz w:val="34"/>
-          <w:szCs w:val="34"/>
-          <w:rtl w:val="0"/>
-        </w:rPr>
-        <w:t xml:space="preserve">Question:</w:t>
-      </w:r>
-    </w:p>
-    <w:p>
-      <w:pPr>
-        <w:spacing w:after="240" w:before="240" w:lineRule="auto"/>
-        <w:rPr/>
-      </w:pPr>
-      <w:r>
-        <w:rPr>
-          <w:rtl w:val="0"/>
-        </w:rPr>
-        <w:t xml:space="preserve">Does the entrepreneur have strengths that improve the chances of success?</w:t>
-      </w:r>
-    </w:p>
-    <w:p>
-      <w:pPr>
-        <w:spacing w:after="240" w:before="240" w:lineRule="auto"/>
-        <w:rPr/>
-      </w:pPr>
-      <w:r>
-        <w:rPr>
-          <w:rtl w:val="0"/>
-        </w:rPr>
-        <w:t xml:space="preserve">Evaluate:</w:t>
-      </w:r>
-    </w:p>
-    <w:p>
-      <w:pPr>
-        <w:numPr>
-          <w:ilvl w:val="0"/>
-          <w:numId w:val="24"/>
-        </w:numPr>
-        <w:spacing w:after="0" w:afterAutospacing="0" w:before="240" w:lineRule="auto"/>
-        <w:ind w:left="720" w:hanging="360"/>
-      </w:pPr>
-      <w:r>
-        <w:rPr>
-          <w:rtl w:val="0"/>
-        </w:rPr>
-        <w:t xml:space="preserve">Relevant experience</w:t>
-      </w:r>
-    </w:p>
-    <w:p>
-      <w:pPr>
-        <w:numPr>
-          <w:ilvl w:val="0"/>
-          <w:numId w:val="24"/>
-        </w:numPr>
-        <w:spacing w:after="0" w:afterAutospacing="0" w:before="0" w:beforeAutospacing="0" w:lineRule="auto"/>
-        <w:ind w:left="720" w:hanging="360"/>
-      </w:pPr>
-      <w:r>
-        <w:rPr>
-          <w:rtl w:val="0"/>
-        </w:rPr>
-        <w:t xml:space="preserve">Industry knowledge</w:t>
-      </w:r>
-    </w:p>
-    <w:p>
-      <w:pPr>
-        <w:numPr>
-          <w:ilvl w:val="0"/>
-          <w:numId w:val="24"/>
-        </w:numPr>
-        <w:spacing w:after="0" w:afterAutospacing="0" w:before="0" w:beforeAutospacing="0" w:lineRule="auto"/>
-        <w:ind w:left="720" w:hanging="360"/>
-      </w:pPr>
-      <w:r>
-        <w:rPr>
-          <w:rtl w:val="0"/>
-        </w:rPr>
-        <w:t xml:space="preserve">Personal connections</w:t>
-      </w:r>
-    </w:p>
-    <w:p>
-      <w:pPr>
-        <w:numPr>
-          <w:ilvl w:val="0"/>
-          <w:numId w:val="24"/>
-        </w:numPr>
-        <w:spacing w:after="0" w:afterAutospacing="0" w:before="0" w:beforeAutospacing="0" w:lineRule="auto"/>
-        <w:ind w:left="720" w:hanging="360"/>
-      </w:pPr>
-      <w:r>
-        <w:rPr>
-          <w:rtl w:val="0"/>
-        </w:rPr>
-        <w:t xml:space="preserve">Unique skills</w:t>
-      </w:r>
-    </w:p>
-    <w:p>
-      <w:pPr>
-        <w:numPr>
-          <w:ilvl w:val="0"/>
-          <w:numId w:val="24"/>
-        </w:numPr>
-        <w:spacing w:after="0" w:afterAutospacing="0" w:before="0" w:beforeAutospacing="0" w:lineRule="auto"/>
-        <w:ind w:left="720" w:hanging="360"/>
-      </w:pPr>
-      <w:r>
-        <w:rPr>
-          <w:rtl w:val="0"/>
-        </w:rPr>
-        <w:t xml:space="preserve">Passion and commitment</w:t>
-      </w:r>
-    </w:p>
-    <w:p>
-      <w:pPr>
-        <w:numPr>
-          <w:ilvl w:val="0"/>
-          <w:numId w:val="24"/>
-        </w:numPr>
-        <w:spacing w:after="240" w:before="0" w:beforeAutospacing="0" w:lineRule="auto"/>
-        <w:ind w:left="720" w:hanging="360"/>
-      </w:pPr>
-      <w:r>
-        <w:rPr>
-          <w:rtl w:val="0"/>
-        </w:rPr>
-        <w:t xml:space="preserve">Access to resources</w:t>
-      </w:r>
-    </w:p>
-    <w:p>
-      <w:pPr>
-        <w:spacing w:after="240" w:before="240" w:lineRule="auto"/>
-        <w:rPr/>
-      </w:pPr>
-      <w:r>
-        <w:rPr>
-          <w:rtl w:val="0"/>
-        </w:rPr>
-        <w:t xml:space="preserve">Score:</w:t>
-      </w:r>
-    </w:p>
-    <w:p>
-      <w:pPr>
-        <w:spacing w:after="240" w:before="240" w:lineRule="auto"/>
-        <w:rPr/>
-      </w:pPr>
-      <w:r>
-        <w:rPr>
-          <w:rtl w:val="0"/>
-        </w:rPr>
-        <w:t xml:space="preserve">__/10</w:t>
-      </w:r>
-    </w:p>
-    <w:p>
-      <w:pPr>
-        <w:rPr/>
-      </w:pPr>
-      <w:r>
-        <w:pict>
-          <v:rect style="width:0.0pt;height:1.5pt" o:hr="t" o:hrstd="t" o:hralign="center" fillcolor="#A0A0A0" stroked="f"/>
-        </w:pict>
-      </w:r>
-      <w:r>
-        <w:rPr>
-          <w:rtl w:val="0"/>
-        </w:rPr>
-      </w:r>
-    </w:p>
-    <w:p>
-      <w:pPr>
-        <w:pStyle w:val="Heading1"/>
-        <w:keepNext w:val="0"/>
-        <w:keepLines w:val="0"/>
-        <w:spacing w:before="480" w:lineRule="auto"/>
-        <w:rPr>
-          <w:b w:val="1"/>
-          <w:bCs w:val="1"/>
-          <w:sz w:val="46"/>
-          <w:szCs w:val="46"/>
-        </w:rPr>
-      </w:pPr>
-      <w:bookmarkStart w:colFirst="0" w:colLast="0" w:name="_6avxyq70j8f6" w:id="60"/>
-      <w:bookmarkEnd w:id="60"/>
-      <w:r>
-        <w:rPr>
-          <w:b w:val="1"/>
-          <w:bCs w:val="1"/>
-          <w:sz w:val="46"/>
-          <w:szCs w:val="46"/>
-          <w:rtl w:val="0"/>
-        </w:rPr>
-        <w:t xml:space="preserve">8. Risk Assessment</w:t>
-      </w:r>
-    </w:p>
-    <w:p>
-      <w:pPr>
-        <w:spacing w:after="240" w:before="240" w:lineRule="auto"/>
-        <w:rPr/>
-      </w:pPr>
-      <w:r>
-        <w:rPr>
-          <w:rtl w:val="0"/>
-        </w:rPr>
-        <w:t xml:space="preserve">Every opportunity has risks.</w:t>
-      </w:r>
-    </w:p>
-    <w:p>
-      <w:pPr>
-        <w:spacing w:after="240" w:before="240" w:lineRule="auto"/>
-        <w:rPr/>
-      </w:pPr>
-      <w:r>
-        <w:rPr>
-          <w:rtl w:val="0"/>
-        </w:rPr>
-        <w:t xml:space="preserve">Identify:</w:t>
-      </w:r>
-    </w:p>
-    <w:p>
-      <w:pPr>
-        <w:pStyle w:val="Heading2"/>
-        <w:keepNext w:val="0"/>
-        <w:keepLines w:val="0"/>
-        <w:spacing w:after="80" w:lineRule="auto"/>
-        <w:rPr>
-          <w:b w:val="1"/>
-          <w:bCs w:val="1"/>
-          <w:sz w:val="34"/>
-          <w:szCs w:val="34"/>
-        </w:rPr>
-      </w:pPr>
-      <w:bookmarkStart w:colFirst="0" w:colLast="0" w:name="_inb7ifqst9fp" w:id="61"/>
-      <w:bookmarkEnd w:id="61"/>
-      <w:r>
-        <w:rPr>
-          <w:b w:val="1"/>
-          <w:bCs w:val="1"/>
-          <w:sz w:val="34"/>
-          <w:szCs w:val="34"/>
-          <w:rtl w:val="0"/>
-        </w:rPr>
-        <w:t xml:space="preserve">Market Risk</w:t>
-      </w:r>
-    </w:p>
-    <w:p>
-      <w:pPr>
-        <w:spacing w:after="240" w:before="240" w:lineRule="auto"/>
-        <w:rPr/>
-      </w:pPr>
-      <w:r>
-        <w:rPr>
-          <w:rtl w:val="0"/>
-        </w:rPr>
-        <w:t xml:space="preserve">Will customers actually want it?</w:t>
-      </w:r>
-    </w:p>
-    <w:p>
-      <w:pPr>
-        <w:pStyle w:val="Heading2"/>
-        <w:keepNext w:val="0"/>
-        <w:keepLines w:val="0"/>
-        <w:spacing w:after="80" w:lineRule="auto"/>
-        <w:rPr>
-          <w:b w:val="1"/>
-          <w:bCs w:val="1"/>
-          <w:sz w:val="34"/>
-          <w:szCs w:val="34"/>
-        </w:rPr>
-      </w:pPr>
-      <w:bookmarkStart w:colFirst="0" w:colLast="0" w:name="_s9ghbxlhf4ng" w:id="62"/>
-      <w:bookmarkEnd w:id="62"/>
-      <w:r>
-        <w:rPr>
-          <w:b w:val="1"/>
-          <w:bCs w:val="1"/>
-          <w:sz w:val="34"/>
-          <w:szCs w:val="34"/>
-          <w:rtl w:val="0"/>
-        </w:rPr>
-        <w:t xml:space="preserve">Financial Risk</w:t>
-      </w:r>
-    </w:p>
-    <w:p>
-      <w:pPr>
-        <w:spacing w:after="240" w:before="240" w:lineRule="auto"/>
-        <w:rPr/>
-      </w:pPr>
-      <w:r>
-        <w:rPr>
-          <w:rtl w:val="0"/>
-        </w:rPr>
-        <w:t xml:space="preserve">Can the business survive financially?</w:t>
-      </w:r>
-    </w:p>
-    <w:p>
-      <w:pPr>
-        <w:pStyle w:val="Heading2"/>
-        <w:keepNext w:val="0"/>
-        <w:keepLines w:val="0"/>
-        <w:spacing w:after="80" w:lineRule="auto"/>
-        <w:rPr>
-          <w:b w:val="1"/>
-          <w:bCs w:val="1"/>
-          <w:sz w:val="34"/>
-          <w:szCs w:val="34"/>
-        </w:rPr>
-      </w:pPr>
-      <w:bookmarkStart w:colFirst="0" w:colLast="0" w:name="_8xtf701bhx9n" w:id="63"/>
-      <w:bookmarkEnd w:id="63"/>
-      <w:r>
-        <w:rPr>
-          <w:b w:val="1"/>
-          <w:bCs w:val="1"/>
-          <w:sz w:val="34"/>
-          <w:szCs w:val="34"/>
-          <w:rtl w:val="0"/>
-        </w:rPr>
-        <w:t xml:space="preserve">Competition Risk</w:t>
-      </w:r>
-    </w:p>
-    <w:p>
-      <w:pPr>
-        <w:spacing w:after="240" w:before="240" w:lineRule="auto"/>
-        <w:rPr/>
-      </w:pPr>
-      <w:r>
-        <w:rPr>
-          <w:rtl w:val="0"/>
-        </w:rPr>
-        <w:t xml:space="preserve">Can competitors copy or outperform it?</w:t>
-      </w:r>
-    </w:p>
-    <w:p>
-      <w:pPr>
-        <w:pStyle w:val="Heading2"/>
-        <w:keepNext w:val="0"/>
-        <w:keepLines w:val="0"/>
-        <w:spacing w:after="80" w:lineRule="auto"/>
-        <w:rPr>
-          <w:b w:val="1"/>
-          <w:bCs w:val="1"/>
-          <w:sz w:val="34"/>
-          <w:szCs w:val="34"/>
-        </w:rPr>
-      </w:pPr>
-      <w:bookmarkStart w:colFirst="0" w:colLast="0" w:name="_ufc4g6yw4zb" w:id="64"/>
-      <w:bookmarkEnd w:id="64"/>
-      <w:r>
-        <w:rPr>
-          <w:b w:val="1"/>
-          <w:bCs w:val="1"/>
-          <w:sz w:val="34"/>
-          <w:szCs w:val="34"/>
-          <w:rtl w:val="0"/>
-        </w:rPr>
-        <w:t xml:space="preserve">Operational Risk</w:t>
-      </w:r>
-    </w:p>
-    <w:p>
-      <w:pPr>
-        <w:spacing w:after="240" w:before="240" w:lineRule="auto"/>
-        <w:rPr/>
-      </w:pPr>
-      <w:r>
-        <w:rPr>
-          <w:rtl w:val="0"/>
-        </w:rPr>
-        <w:t xml:space="preserve">Can it be delivered consistently?</w:t>
-      </w:r>
-    </w:p>
-    <w:p>
-      <w:pPr>
-        <w:pStyle w:val="Heading2"/>
-        <w:keepNext w:val="0"/>
-        <w:keepLines w:val="0"/>
-        <w:spacing w:after="80" w:lineRule="auto"/>
-        <w:rPr>
-          <w:b w:val="1"/>
-          <w:bCs w:val="1"/>
-          <w:sz w:val="34"/>
-          <w:szCs w:val="34"/>
-        </w:rPr>
-      </w:pPr>
-      <w:bookmarkStart w:colFirst="0" w:colLast="0" w:name="_v7adsfntqfpu" w:id="65"/>
-      <w:bookmarkEnd w:id="65"/>
-      <w:r>
-        <w:rPr>
-          <w:b w:val="1"/>
-          <w:bCs w:val="1"/>
-          <w:sz w:val="34"/>
-          <w:szCs w:val="34"/>
-          <w:rtl w:val="0"/>
-        </w:rPr>
-        <w:t xml:space="preserve">Regulatory Risk</w:t>
-      </w:r>
-    </w:p>
-    <w:p>
-      <w:pPr>
-        <w:spacing w:after="240" w:before="240" w:lineRule="auto"/>
-        <w:rPr/>
-      </w:pPr>
-      <w:r>
-        <w:rPr>
-          <w:rtl w:val="0"/>
-        </w:rPr>
-        <w:t xml:space="preserve">Are there legal restrictions?</w:t>
-      </w:r>
-    </w:p>
-    <w:p>
-      <w:pPr>
-        <w:rPr/>
-      </w:pPr>
-      <w:r>
-        <w:pict>
-          <v:rect style="width:0.0pt;height:1.5pt" o:hr="t" o:hrstd="t" o:hralign="center" fillcolor="#A0A0A0" stroked="f"/>
-        </w:pict>
-      </w:r>
-      <w:r>
-        <w:rPr>
-          <w:rtl w:val="0"/>
-        </w:rPr>
-      </w:r>
-    </w:p>
-    <w:p>
-      <w:pPr>
-        <w:pStyle w:val="Heading1"/>
-        <w:keepNext w:val="0"/>
-        <w:keepLines w:val="0"/>
-        <w:spacing w:before="480" w:lineRule="auto"/>
-        <w:rPr>
-          <w:b w:val="1"/>
-          <w:bCs w:val="1"/>
-          <w:sz w:val="46"/>
-          <w:szCs w:val="46"/>
-        </w:rPr>
-      </w:pPr>
-      <w:bookmarkStart w:colFirst="0" w:colLast="0" w:name="_30x6sumub8mb" w:id="66"/>
-      <w:bookmarkEnd w:id="66"/>
-      <w:r>
-        <w:rPr>
-          <w:b w:val="1"/>
-          <w:bCs w:val="1"/>
-          <w:sz w:val="46"/>
-          <w:szCs w:val="46"/>
-          <w:rtl w:val="0"/>
-        </w:rPr>
-        <w:t xml:space="preserve">Risk Score:</w:t>
-      </w:r>
-    </w:p>
-    <w:p>
-      <w:pPr>
-        <w:spacing w:after="240" w:before="240" w:lineRule="auto"/>
-        <w:rPr/>
-      </w:pPr>
-      <w:r>
-        <w:rPr>
-          <w:rtl w:val="0"/>
-        </w:rPr>
-        <w:t xml:space="preserve">Low / Medium / High</w:t>
-      </w:r>
-    </w:p>
-    <w:p>
-      <w:pPr>
-        <w:rPr/>
-      </w:pPr>
-      <w:r>
-        <w:pict>
-          <v:rect style="width:0.0pt;height:1.5pt" o:hr="t" o:hrstd="t" o:hralign="center" fillcolor="#A0A0A0" stroked="f"/>
-        </w:pict>
-      </w:r>
-      <w:r>
-        <w:rPr>
-          <w:rtl w:val="0"/>
-        </w:rPr>
-      </w:r>
-    </w:p>
-    <w:p>
-      <w:pPr>
-        <w:pStyle w:val="Heading1"/>
-        <w:keepNext w:val="0"/>
-        <w:keepLines w:val="0"/>
-        <w:spacing w:before="480" w:lineRule="auto"/>
-        <w:rPr>
-          <w:b w:val="1"/>
-          <w:bCs w:val="1"/>
-          <w:sz w:val="46"/>
-          <w:szCs w:val="46"/>
-        </w:rPr>
-      </w:pPr>
-      <w:bookmarkStart w:colFirst="0" w:colLast="0" w:name="_75udj9pvcfvv" w:id="67"/>
-      <w:bookmarkEnd w:id="67"/>
-      <w:r>
-        <w:rPr>
-          <w:b w:val="1"/>
-          <w:bCs w:val="1"/>
-          <w:sz w:val="46"/>
-          <w:szCs w:val="46"/>
-          <w:rtl w:val="0"/>
-        </w:rPr>
-        <w:t xml:space="preserve">9. Opportunity Ranking Matrix</w:t>
-      </w:r>
-    </w:p>
-    <w:p>
-      <w:pPr>
-        <w:spacing w:after="240" w:before="240" w:lineRule="auto"/>
-        <w:rPr/>
-      </w:pPr>
-      <w:r>
-        <w:rPr>
-          <w:rtl w:val="0"/>
-        </w:rPr>
-        <w:t xml:space="preserve">After scoring, place the idea into one of four categories.</w:t>
-      </w:r>
-    </w:p>
-    <w:p>
-      <w:pPr>
-        <w:pStyle w:val="Heading2"/>
-        <w:keepNext w:val="0"/>
-        <w:keepLines w:val="0"/>
-        <w:spacing w:after="80" w:lineRule="auto"/>
-        <w:rPr>
-          <w:b w:val="1"/>
-          <w:bCs w:val="1"/>
-          <w:sz w:val="34"/>
-          <w:szCs w:val="34"/>
-        </w:rPr>
-      </w:pPr>
-      <w:bookmarkStart w:colFirst="0" w:colLast="0" w:name="_sij65kyuym2k" w:id="68"/>
-      <w:bookmarkEnd w:id="68"/>
-      <w:r>
-        <w:rPr>
-          <w:b w:val="1"/>
-          <w:bCs w:val="1"/>
-          <w:sz w:val="34"/>
-          <w:szCs w:val="34"/>
-          <w:rtl w:val="0"/>
-        </w:rPr>
-        <w:t xml:space="preserve">High Opportunity / Low Difficulty</w:t>
-      </w:r>
-    </w:p>
-    <w:p>
-      <w:pPr>
-        <w:pStyle w:val="Heading3"/>
-        <w:keepNext w:val="0"/>
-        <w:keepLines w:val="0"/>
-        <w:spacing w:before="280" w:lineRule="auto"/>
-        <w:rPr>
-          <w:b w:val="1"/>
-          <w:bCs w:val="1"/>
-          <w:color w:val="000000"/>
-          <w:sz w:val="26"/>
-          <w:szCs w:val="26"/>
-        </w:rPr>
-      </w:pPr>
-      <w:bookmarkStart w:colFirst="0" w:colLast="0" w:name="_3zsi7s2n1p4h" w:id="69"/>
-      <w:bookmarkEnd w:id="69"/>
-      <w:r>
-        <w:rPr>
-          <w:b w:val="1"/>
-          <w:bCs w:val="1"/>
-          <w:color w:val="000000"/>
-          <w:sz w:val="26"/>
-          <w:szCs w:val="26"/>
-          <w:rtl w:val="0"/>
-        </w:rPr>
-        <w:t xml:space="preserve">Action:</w:t>
-      </w:r>
-    </w:p>
-    <w:p>
-      <w:pPr>
-        <w:spacing w:after="240" w:before="240" w:lineRule="auto"/>
-        <w:rPr/>
-      </w:pPr>
-      <w:r>
-        <w:rPr>
-          <w:rtl w:val="0"/>
-        </w:rPr>
-        <w:t xml:space="preserve">Prioritise immediately.</w:t>
-      </w:r>
-    </w:p>
-    <w:p>
-      <w:pPr>
-        <w:spacing w:after="240" w:before="240" w:lineRule="auto"/>
-        <w:rPr/>
-      </w:pPr>
-      <w:r>
-        <w:rPr>
-          <w:rtl w:val="0"/>
-        </w:rPr>
-        <w:t xml:space="preserve">Characteristics:</w:t>
-      </w:r>
-    </w:p>
-    <w:p>
-      <w:pPr>
-        <w:numPr>
-          <w:ilvl w:val="0"/>
-          <w:numId w:val="12"/>
-        </w:numPr>
-        <w:spacing w:after="0" w:afterAutospacing="0" w:before="240" w:lineRule="auto"/>
-        <w:ind w:left="720" w:hanging="360"/>
-      </w:pPr>
-      <w:r>
-        <w:rPr>
-          <w:rtl w:val="0"/>
-        </w:rPr>
-        <w:t xml:space="preserve">Strong demand</w:t>
-      </w:r>
-    </w:p>
-    <w:p>
-      <w:pPr>
-        <w:numPr>
-          <w:ilvl w:val="0"/>
-          <w:numId w:val="12"/>
-        </w:numPr>
-        <w:spacing w:after="0" w:afterAutospacing="0" w:before="0" w:beforeAutospacing="0" w:lineRule="auto"/>
-        <w:ind w:left="720" w:hanging="360"/>
-      </w:pPr>
-      <w:r>
-        <w:rPr>
-          <w:rtl w:val="0"/>
-        </w:rPr>
-        <w:t xml:space="preserve">Clear customer problem</w:t>
-      </w:r>
-    </w:p>
-    <w:p>
-      <w:pPr>
-        <w:numPr>
-          <w:ilvl w:val="0"/>
-          <w:numId w:val="12"/>
-        </w:numPr>
-        <w:spacing w:after="0" w:afterAutospacing="0" w:before="0" w:beforeAutospacing="0" w:lineRule="auto"/>
-        <w:ind w:left="720" w:hanging="360"/>
-      </w:pPr>
-      <w:r>
-        <w:rPr>
-          <w:rtl w:val="0"/>
-        </w:rPr>
-        <w:t xml:space="preserve">Easy to test</w:t>
-      </w:r>
-    </w:p>
-    <w:p>
-      <w:pPr>
-        <w:numPr>
-          <w:ilvl w:val="0"/>
-          <w:numId w:val="12"/>
-        </w:numPr>
-        <w:spacing w:after="240" w:before="0" w:beforeAutospacing="0" w:lineRule="auto"/>
-        <w:ind w:left="720" w:hanging="360"/>
-      </w:pPr>
-      <w:r>
-        <w:rPr>
-          <w:rtl w:val="0"/>
-        </w:rPr>
-        <w:t xml:space="preserve">Good business potential</w:t>
-      </w:r>
-    </w:p>
-    <w:p>
-      <w:pPr>
-        <w:rPr/>
-      </w:pPr>
-      <w:r>
-        <w:pict>
-          <v:rect style="width:0.0pt;height:1.5pt" o:hr="t" o:hrstd="t" o:hralign="center" fillcolor="#A0A0A0" stroked="f"/>
-        </w:pict>
-      </w:r>
-      <w:r>
-        <w:rPr>
-          <w:rtl w:val="0"/>
-        </w:rPr>
-      </w:r>
-    </w:p>
-    <w:p>
-      <w:pPr>
-        <w:pStyle w:val="Heading2"/>
-        <w:keepNext w:val="0"/>
-        <w:keepLines w:val="0"/>
-        <w:spacing w:after="80" w:lineRule="auto"/>
-        <w:rPr>
-          <w:b w:val="1"/>
-          <w:bCs w:val="1"/>
-          <w:sz w:val="34"/>
-          <w:szCs w:val="34"/>
-        </w:rPr>
-      </w:pPr>
-      <w:bookmarkStart w:colFirst="0" w:colLast="0" w:name="_2u4c6rgy1uaq" w:id="70"/>
-      <w:bookmarkEnd w:id="70"/>
-      <w:r>
-        <w:rPr>
-          <w:b w:val="1"/>
-          <w:bCs w:val="1"/>
-          <w:sz w:val="34"/>
-          <w:szCs w:val="34"/>
-          <w:rtl w:val="0"/>
-        </w:rPr>
-        <w:t xml:space="preserve">High Opportunity / High Difficulty</w:t>
-      </w:r>
-    </w:p>
-    <w:p>
-      <w:pPr>
-        <w:pStyle w:val="Heading3"/>
-        <w:keepNext w:val="0"/>
-        <w:keepLines w:val="0"/>
-        <w:spacing w:before="280" w:lineRule="auto"/>
-        <w:rPr>
-          <w:b w:val="1"/>
-          <w:bCs w:val="1"/>
-          <w:color w:val="000000"/>
-          <w:sz w:val="26"/>
-          <w:szCs w:val="26"/>
-        </w:rPr>
-      </w:pPr>
-      <w:bookmarkStart w:colFirst="0" w:colLast="0" w:name="_b6enemyenkae" w:id="71"/>
-      <w:bookmarkEnd w:id="71"/>
-      <w:r>
-        <w:rPr>
-          <w:b w:val="1"/>
-          <w:bCs w:val="1"/>
-          <w:color w:val="000000"/>
-          <w:sz w:val="26"/>
-          <w:szCs w:val="26"/>
-          <w:rtl w:val="0"/>
-        </w:rPr>
-        <w:t xml:space="preserve">Action:</w:t>
-      </w:r>
-    </w:p>
-    <w:p>
-      <w:pPr>
-        <w:spacing w:after="240" w:before="240" w:lineRule="auto"/>
-        <w:rPr/>
-      </w:pPr>
-      <w:r>
-        <w:rPr>
-          <w:rtl w:val="0"/>
-        </w:rPr>
-        <w:t xml:space="preserve">Develop a detailed strategy.</w:t>
-      </w:r>
-    </w:p>
-    <w:p>
-      <w:pPr>
-        <w:spacing w:after="240" w:before="240" w:lineRule="auto"/>
-        <w:rPr/>
-      </w:pPr>
-      <w:r>
-        <w:rPr>
-          <w:rtl w:val="0"/>
-        </w:rPr>
-        <w:t xml:space="preserve">Characteristics:</w:t>
-      </w:r>
-    </w:p>
-    <w:p>
-      <w:pPr>
-        <w:numPr>
-          <w:ilvl w:val="0"/>
-          <w:numId w:val="7"/>
-        </w:numPr>
-        <w:spacing w:after="0" w:afterAutospacing="0" w:before="240" w:lineRule="auto"/>
-        <w:ind w:left="720" w:hanging="360"/>
-      </w:pPr>
-      <w:r>
-        <w:rPr>
-          <w:rtl w:val="0"/>
-        </w:rPr>
-        <w:t xml:space="preserve">Large potential</w:t>
-      </w:r>
-    </w:p>
-    <w:p>
-      <w:pPr>
-        <w:numPr>
-          <w:ilvl w:val="0"/>
-          <w:numId w:val="7"/>
-        </w:numPr>
-        <w:spacing w:after="0" w:afterAutospacing="0" w:before="0" w:beforeAutospacing="0" w:lineRule="auto"/>
-        <w:ind w:left="720" w:hanging="360"/>
-      </w:pPr>
-      <w:r>
-        <w:rPr>
-          <w:rtl w:val="0"/>
-        </w:rPr>
-        <w:t xml:space="preserve">Requires investment</w:t>
-      </w:r>
-    </w:p>
-    <w:p>
-      <w:pPr>
-        <w:numPr>
-          <w:ilvl w:val="0"/>
-          <w:numId w:val="7"/>
-        </w:numPr>
-        <w:spacing w:after="240" w:before="0" w:beforeAutospacing="0" w:lineRule="auto"/>
-        <w:ind w:left="720" w:hanging="360"/>
-      </w:pPr>
-      <w:r>
-        <w:rPr>
-          <w:rtl w:val="0"/>
-        </w:rPr>
-        <w:t xml:space="preserve">Needs strong execution</w:t>
-      </w:r>
-    </w:p>
-    <w:p>
-      <w:pPr>
-        <w:rPr/>
-      </w:pPr>
-      <w:r>
-        <w:pict>
-          <v:rect style="width:0.0pt;height:1.5pt" o:hr="t" o:hrstd="t" o:hralign="center" fillcolor="#A0A0A0" stroked="f"/>
-        </w:pict>
-      </w:r>
-      <w:r>
-        <w:rPr>
-          <w:rtl w:val="0"/>
-        </w:rPr>
-      </w:r>
-    </w:p>
-    <w:p>
-      <w:pPr>
-        <w:pStyle w:val="Heading2"/>
-        <w:keepNext w:val="0"/>
-        <w:keepLines w:val="0"/>
-        <w:spacing w:after="80" w:lineRule="auto"/>
-        <w:rPr>
-          <w:b w:val="1"/>
-          <w:bCs w:val="1"/>
-          <w:sz w:val="34"/>
-          <w:szCs w:val="34"/>
-        </w:rPr>
-      </w:pPr>
-      <w:bookmarkStart w:colFirst="0" w:colLast="0" w:name="_2zd7rkwl00wo" w:id="72"/>
-      <w:bookmarkEnd w:id="72"/>
-      <w:r>
-        <w:rPr>
-          <w:b w:val="1"/>
-          <w:bCs w:val="1"/>
-          <w:sz w:val="34"/>
-          <w:szCs w:val="34"/>
-          <w:rtl w:val="0"/>
-        </w:rPr>
-        <w:t xml:space="preserve">Low Opportunity / Low Difficulty</w:t>
-      </w:r>
-    </w:p>
-    <w:p>
-      <w:pPr>
-        <w:pStyle w:val="Heading3"/>
-        <w:keepNext w:val="0"/>
-        <w:keepLines w:val="0"/>
-        <w:spacing w:before="280" w:lineRule="auto"/>
-        <w:rPr>
-          <w:b w:val="1"/>
-          <w:bCs w:val="1"/>
-          <w:color w:val="000000"/>
-          <w:sz w:val="26"/>
-          <w:szCs w:val="26"/>
-        </w:rPr>
-      </w:pPr>
-      <w:bookmarkStart w:colFirst="0" w:colLast="0" w:name="_cwu1x9gxb4ms" w:id="73"/>
-      <w:bookmarkEnd w:id="73"/>
-      <w:r>
-        <w:rPr>
-          <w:b w:val="1"/>
-          <w:bCs w:val="1"/>
-          <w:color w:val="000000"/>
-          <w:sz w:val="26"/>
-          <w:szCs w:val="26"/>
-          <w:rtl w:val="0"/>
-        </w:rPr>
-        <w:t xml:space="preserve">Action:</w:t>
-      </w:r>
-    </w:p>
-    <w:p>
-      <w:pPr>
-        <w:spacing w:after="240" w:before="240" w:lineRule="auto"/>
-        <w:rPr/>
-      </w:pPr>
-      <w:r>
-        <w:rPr>
-          <w:rtl w:val="0"/>
-        </w:rPr>
-        <w:t xml:space="preserve">Test cheaply.</w:t>
-      </w:r>
-    </w:p>
-    <w:p>
-      <w:pPr>
-        <w:spacing w:after="240" w:before="240" w:lineRule="auto"/>
-        <w:rPr/>
-      </w:pPr>
-      <w:r>
-        <w:rPr>
-          <w:rtl w:val="0"/>
-        </w:rPr>
-        <w:t xml:space="preserve">Characteristics:</w:t>
-      </w:r>
-    </w:p>
-    <w:p>
-      <w:pPr>
-        <w:numPr>
-          <w:ilvl w:val="0"/>
-          <w:numId w:val="6"/>
-        </w:numPr>
-        <w:spacing w:after="0" w:afterAutospacing="0" w:before="240" w:lineRule="auto"/>
-        <w:ind w:left="720" w:hanging="360"/>
-      </w:pPr>
-      <w:r>
-        <w:rPr>
-          <w:rtl w:val="0"/>
-        </w:rPr>
-        <w:t xml:space="preserve">Easy to launch</w:t>
-      </w:r>
-    </w:p>
-    <w:p>
-      <w:pPr>
-        <w:numPr>
-          <w:ilvl w:val="0"/>
-          <w:numId w:val="6"/>
-        </w:numPr>
-        <w:spacing w:after="240" w:before="0" w:beforeAutospacing="0" w:lineRule="auto"/>
-        <w:ind w:left="720" w:hanging="360"/>
-      </w:pPr>
-      <w:r>
-        <w:rPr>
-          <w:rtl w:val="0"/>
-        </w:rPr>
-        <w:t xml:space="preserve">Limited growth potential</w:t>
-      </w:r>
-    </w:p>
-    <w:p>
-      <w:pPr>
-        <w:rPr/>
-      </w:pPr>
-      <w:r>
-        <w:pict>
-          <v:rect style="width:0.0pt;height:1.5pt" o:hr="t" o:hrstd="t" o:hralign="center" fillcolor="#A0A0A0" stroked="f"/>
-        </w:pict>
-      </w:r>
-      <w:r>
-        <w:rPr>
-          <w:rtl w:val="0"/>
-        </w:rPr>
-      </w:r>
-    </w:p>
-    <w:p>
-      <w:pPr>
-        <w:pStyle w:val="Heading2"/>
-        <w:keepNext w:val="0"/>
-        <w:keepLines w:val="0"/>
-        <w:spacing w:after="80" w:lineRule="auto"/>
-        <w:rPr>
-          <w:b w:val="1"/>
-          <w:bCs w:val="1"/>
-          <w:sz w:val="34"/>
-          <w:szCs w:val="34"/>
-        </w:rPr>
-      </w:pPr>
-      <w:bookmarkStart w:colFirst="0" w:colLast="0" w:name="_y97iki7dczyt" w:id="74"/>
-      <w:bookmarkEnd w:id="74"/>
-      <w:r>
-        <w:rPr>
-          <w:b w:val="1"/>
-          <w:bCs w:val="1"/>
-          <w:sz w:val="34"/>
-          <w:szCs w:val="34"/>
-          <w:rtl w:val="0"/>
-        </w:rPr>
-        <w:t xml:space="preserve">Low Opportunity / High Difficulty</w:t>
-      </w:r>
-    </w:p>
-    <w:p>
-      <w:pPr>
-        <w:pStyle w:val="Heading3"/>
-        <w:keepNext w:val="0"/>
-        <w:keepLines w:val="0"/>
-        <w:spacing w:before="280" w:lineRule="auto"/>
-        <w:rPr>
-          <w:b w:val="1"/>
-          <w:bCs w:val="1"/>
-          <w:color w:val="000000"/>
-          <w:sz w:val="26"/>
-          <w:szCs w:val="26"/>
-        </w:rPr>
-      </w:pPr>
-      <w:bookmarkStart w:colFirst="0" w:colLast="0" w:name="_uth4v1y9f5s9" w:id="75"/>
-      <w:bookmarkEnd w:id="75"/>
-      <w:r>
-        <w:rPr>
-          <w:b w:val="1"/>
-          <w:bCs w:val="1"/>
-          <w:color w:val="000000"/>
-          <w:sz w:val="26"/>
-          <w:szCs w:val="26"/>
-          <w:rtl w:val="0"/>
-        </w:rPr>
-        <w:t xml:space="preserve">Action:</w:t>
-      </w:r>
-    </w:p>
-    <w:p>
-      <w:pPr>
-        <w:spacing w:after="240" w:before="240" w:lineRule="auto"/>
-        <w:rPr/>
-      </w:pPr>
-      <w:r>
-        <w:rPr>
-          <w:rtl w:val="0"/>
-        </w:rPr>
-        <w:t xml:space="preserve">Avoid or redesign.</w:t>
-      </w:r>
-    </w:p>
-    <w:p>
-      <w:pPr>
-        <w:spacing w:after="240" w:before="240" w:lineRule="auto"/>
-        <w:rPr/>
-      </w:pPr>
-      <w:r>
-        <w:rPr>
-          <w:rtl w:val="0"/>
-        </w:rPr>
-        <w:t xml:space="preserve">Characteristics:</w:t>
-      </w:r>
-    </w:p>
-    <w:p>
-      <w:pPr>
-        <w:numPr>
-          <w:ilvl w:val="0"/>
-          <w:numId w:val="28"/>
-        </w:numPr>
-        <w:spacing w:after="0" w:afterAutospacing="0" w:before="240" w:lineRule="auto"/>
-        <w:ind w:left="720" w:hanging="360"/>
-      </w:pPr>
-      <w:r>
-        <w:rPr>
-          <w:rtl w:val="0"/>
-        </w:rPr>
-        <w:t xml:space="preserve">Weak demand</w:t>
-      </w:r>
-    </w:p>
-    <w:p>
-      <w:pPr>
-        <w:numPr>
-          <w:ilvl w:val="0"/>
-          <w:numId w:val="28"/>
-        </w:numPr>
-        <w:spacing w:after="0" w:afterAutospacing="0" w:before="0" w:beforeAutospacing="0" w:lineRule="auto"/>
-        <w:ind w:left="720" w:hanging="360"/>
-      </w:pPr>
-      <w:r>
-        <w:rPr>
-          <w:rtl w:val="0"/>
-        </w:rPr>
-        <w:t xml:space="preserve">High costs</w:t>
-      </w:r>
-    </w:p>
-    <w:p>
-      <w:pPr>
-        <w:numPr>
-          <w:ilvl w:val="0"/>
-          <w:numId w:val="28"/>
-        </w:numPr>
-        <w:spacing w:after="240" w:before="0" w:beforeAutospacing="0" w:lineRule="auto"/>
-        <w:ind w:left="720" w:hanging="360"/>
-      </w:pPr>
-      <w:r>
-        <w:rPr>
-          <w:rtl w:val="0"/>
-        </w:rPr>
-        <w:t xml:space="preserve">Difficult execution</w:t>
-      </w:r>
-    </w:p>
-    <w:p>
-      <w:pPr>
-        <w:rPr/>
-      </w:pPr>
-      <w:r>
-        <w:pict>
-          <v:rect style="width:0.0pt;height:1.5pt" o:hr="t" o:hrstd="t" o:hralign="center" fillcolor="#A0A0A0" stroked="f"/>
-        </w:pict>
-      </w:r>
-      <w:r>
-        <w:rPr>
-          <w:rtl w:val="0"/>
-        </w:rPr>
-      </w:r>
-    </w:p>
-    <w:p>
-      <w:pPr>
-        <w:pStyle w:val="Heading1"/>
-        <w:keepNext w:val="0"/>
-        <w:keepLines w:val="0"/>
-        <w:spacing w:before="480" w:lineRule="auto"/>
-        <w:rPr>
-          <w:b w:val="1"/>
-          <w:bCs w:val="1"/>
-          <w:sz w:val="46"/>
-          <w:szCs w:val="46"/>
-        </w:rPr>
-      </w:pPr>
-      <w:bookmarkStart w:colFirst="0" w:colLast="0" w:name="_62m9nzbupf31" w:id="76"/>
-      <w:bookmarkEnd w:id="76"/>
-      <w:r>
-        <w:rPr>
-          <w:b w:val="1"/>
-          <w:bCs w:val="1"/>
-          <w:sz w:val="46"/>
-          <w:szCs w:val="46"/>
-          <w:rtl w:val="0"/>
-        </w:rPr>
-        <w:t xml:space="preserve">10. Final Opportunity Score Calculation</w:t>
-      </w:r>
-    </w:p>
-    <w:p>
-      <w:pPr>
-        <w:spacing w:after="240" w:before="240" w:lineRule="auto"/>
-        <w:rPr/>
-      </w:pPr>
-      <w:r>
-        <w:rPr>
-          <w:rtl w:val="0"/>
-        </w:rPr>
-        <w:t xml:space="preserve">Add the category scores:</w:t>
-      </w:r>
-    </w:p>
-    <w:p>
-      <w:pPr>
-        <w:spacing w:after="240" w:before="240" w:lineRule="auto"/>
-        <w:rPr/>
-      </w:pPr>
-      <w:r>
-        <w:rPr>
-          <w:rtl w:val="0"/>
-        </w:rPr>
-        <w:t xml:space="preserve">Problem Strength:</w:t>
-        <w:br w:type="textWrapping"/>
-        <w:t xml:space="preserve"> __/10</w:t>
-      </w:r>
-    </w:p>
-    <w:p>
-      <w:pPr>
-        <w:spacing w:after="240" w:before="240" w:lineRule="auto"/>
-        <w:rPr/>
-      </w:pPr>
-      <w:r>
-        <w:rPr>
-          <w:rtl w:val="0"/>
-        </w:rPr>
-        <w:t xml:space="preserve">Customer Demand:</w:t>
-        <w:br w:type="textWrapping"/>
-        <w:t xml:space="preserve"> __/10</w:t>
-      </w:r>
-    </w:p>
-    <w:p>
-      <w:pPr>
-        <w:spacing w:after="240" w:before="240" w:lineRule="auto"/>
-        <w:rPr/>
-      </w:pPr>
-      <w:r>
-        <w:rPr>
-          <w:rtl w:val="0"/>
-        </w:rPr>
-        <w:t xml:space="preserve">Market Opportunity:</w:t>
-        <w:br w:type="textWrapping"/>
-        <w:t xml:space="preserve"> __/10</w:t>
-      </w:r>
-    </w:p>
-    <w:p>
-      <w:pPr>
-        <w:spacing w:after="240" w:before="240" w:lineRule="auto"/>
-        <w:rPr/>
-      </w:pPr>
-      <w:r>
-        <w:rPr>
-          <w:rtl w:val="0"/>
-        </w:rPr>
-        <w:t xml:space="preserve">Business Model Potential:</w:t>
-        <w:br w:type="textWrapping"/>
-        <w:t xml:space="preserve"> __/10</w:t>
-      </w:r>
-    </w:p>
-    <w:p>
-      <w:pPr>
-        <w:spacing w:after="240" w:before="240" w:lineRule="auto"/>
-        <w:rPr/>
-      </w:pPr>
-      <w:r>
-        <w:rPr>
-          <w:rtl w:val="0"/>
-        </w:rPr>
-        <w:t xml:space="preserve">Competitive Advantage:</w:t>
-        <w:br w:type="textWrapping"/>
-        <w:t xml:space="preserve"> __/10</w:t>
-      </w:r>
-    </w:p>
-    <w:p>
-      <w:pPr>
-        <w:spacing w:after="240" w:before="240" w:lineRule="auto"/>
-        <w:rPr/>
-      </w:pPr>
-      <w:r>
-        <w:rPr>
-          <w:rtl w:val="0"/>
-        </w:rPr>
-        <w:t xml:space="preserve">Execution Feasibility:</w:t>
-        <w:br w:type="textWrapping"/>
-        <w:t xml:space="preserve"> __/10</w:t>
-      </w:r>
-    </w:p>
-    <w:p>
-      <w:pPr>
-        <w:spacing w:after="240" w:before="240" w:lineRule="auto"/>
-        <w:rPr/>
-      </w:pPr>
-      <w:r>
-        <w:rPr>
-          <w:rtl w:val="0"/>
-        </w:rPr>
-        <w:t xml:space="preserve">Founder Advantage:</w:t>
-        <w:br w:type="textWrapping"/>
-        <w:t xml:space="preserve"> __/10</w:t>
-      </w:r>
-    </w:p>
-    <w:p>
-      <w:pPr>
-        <w:rPr/>
-      </w:pPr>
-      <w:r>
-        <w:pict>
-          <v:rect style="width:0.0pt;height:1.5pt" o:hr="t" o:hrstd="t" o:hralign="center" fillcolor="#A0A0A0" stroked="f"/>
-        </w:pict>
-      </w:r>
-      <w:r>
-        <w:rPr>
-          <w:rtl w:val="0"/>
-        </w:rPr>
-      </w:r>
-    </w:p>
-    <w:p>
-      <w:pPr>
-        <w:pStyle w:val="Heading2"/>
-        <w:keepNext w:val="0"/>
-        <w:keepLines w:val="0"/>
-        <w:spacing w:after="80" w:lineRule="auto"/>
-        <w:rPr>
-          <w:b w:val="1"/>
-          <w:bCs w:val="1"/>
-          <w:sz w:val="34"/>
-          <w:szCs w:val="34"/>
-        </w:rPr>
-      </w:pPr>
-      <w:bookmarkStart w:colFirst="0" w:colLast="0" w:name="_kvswsnkjty7o" w:id="77"/>
-      <w:bookmarkEnd w:id="77"/>
-      <w:r>
-        <w:rPr>
-          <w:b w:val="1"/>
-          <w:bCs w:val="1"/>
-          <w:sz w:val="34"/>
-          <w:szCs w:val="34"/>
-          <w:rtl w:val="0"/>
-        </w:rPr>
-        <w:t xml:space="preserve">Total Score:</w:t>
-      </w:r>
-    </w:p>
-    <w:p>
-      <w:pPr>
-        <w:spacing w:after="240" w:before="240" w:lineRule="auto"/>
-        <w:rPr/>
-      </w:pPr>
-      <w:r>
-        <w:rPr>
-          <w:rtl w:val="0"/>
-        </w:rPr>
-        <w:t xml:space="preserve">__/70</w:t>
-      </w:r>
-    </w:p>
-    <w:p>
-      <w:pPr>
-        <w:rPr/>
-      </w:pPr>
-      <w:r>
-        <w:pict>
-          <v:rect style="width:0.0pt;height:1.5pt" o:hr="t" o:hrstd="t" o:hralign="center" fillcolor="#A0A0A0" stroked="f"/>
-        </w:pict>
-      </w:r>
-      <w:r>
-        <w:rPr>
-          <w:rtl w:val="0"/>
-        </w:rPr>
-      </w:r>
-    </w:p>
-    <w:p>
-      <w:pPr>
-        <w:pStyle w:val="Heading1"/>
-        <w:keepNext w:val="0"/>
-        <w:keepLines w:val="0"/>
-        <w:spacing w:before="480" w:lineRule="auto"/>
-        <w:rPr>
-          <w:b w:val="1"/>
-          <w:bCs w:val="1"/>
-          <w:sz w:val="46"/>
-          <w:szCs w:val="46"/>
-        </w:rPr>
-      </w:pPr>
-      <w:bookmarkStart w:colFirst="0" w:colLast="0" w:name="_42rtyaylcaog" w:id="78"/>
-      <w:bookmarkEnd w:id="78"/>
-      <w:r>
-        <w:rPr>
-          <w:b w:val="1"/>
-          <w:bCs w:val="1"/>
-          <w:sz w:val="46"/>
-          <w:szCs w:val="46"/>
-          <w:rtl w:val="0"/>
-        </w:rPr>
-        <w:t xml:space="preserve">Opportunity Rating</w:t>
-      </w:r>
-    </w:p>
-    <w:p>
-      <w:pPr>
-        <w:pStyle w:val="Heading2"/>
-        <w:keepNext w:val="0"/>
-        <w:keepLines w:val="0"/>
-        <w:spacing w:after="80" w:lineRule="auto"/>
-        <w:rPr>
-          <w:b w:val="1"/>
-          <w:bCs w:val="1"/>
-          <w:sz w:val="34"/>
-          <w:szCs w:val="34"/>
-        </w:rPr>
-      </w:pPr>
-      <w:bookmarkStart w:colFirst="0" w:colLast="0" w:name="_rz12fzrxbt8j" w:id="79"/>
-      <w:bookmarkEnd w:id="79"/>
-      <w:r>
-        <w:rPr>
-          <w:b w:val="1"/>
-          <w:bCs w:val="1"/>
-          <w:sz w:val="34"/>
-          <w:szCs w:val="34"/>
-          <w:rtl w:val="0"/>
-        </w:rPr>
-        <w:t xml:space="preserve">60-70:</w:t>
-      </w:r>
-    </w:p>
-    <w:p>
-      <w:pPr>
-        <w:spacing w:after="240" w:before="240" w:lineRule="auto"/>
-        <w:rPr/>
-      </w:pPr>
-      <w:r>
-        <w:rPr>
-          <w:rtl w:val="0"/>
-        </w:rPr>
-        <w:t xml:space="preserve">Exceptional Opportunity</w:t>
-      </w:r>
-    </w:p>
-    <w:p>
-      <w:pPr>
-        <w:spacing w:after="240" w:before="240" w:lineRule="auto"/>
-        <w:rPr/>
-      </w:pPr>
-      <w:r>
-        <w:rPr>
-          <w:rtl w:val="0"/>
-        </w:rPr>
-        <w:t xml:space="preserve">Strong evidence. Worth serious investment.</w:t>
-      </w:r>
-    </w:p>
-    <w:p>
-      <w:pPr>
-        <w:pStyle w:val="Heading2"/>
-        <w:keepNext w:val="0"/>
-        <w:keepLines w:val="0"/>
-        <w:spacing w:after="80" w:lineRule="auto"/>
-        <w:rPr>
-          <w:b w:val="1"/>
-          <w:bCs w:val="1"/>
-          <w:sz w:val="34"/>
-          <w:szCs w:val="34"/>
-        </w:rPr>
-      </w:pPr>
-      <w:bookmarkStart w:colFirst="0" w:colLast="0" w:name="_uz7knlyoa94" w:id="80"/>
-      <w:bookmarkEnd w:id="80"/>
-      <w:r>
-        <w:rPr>
-          <w:b w:val="1"/>
-          <w:bCs w:val="1"/>
-          <w:sz w:val="34"/>
-          <w:szCs w:val="34"/>
-          <w:rtl w:val="0"/>
-        </w:rPr>
-        <w:t xml:space="preserve">45-59:</w:t>
-      </w:r>
-    </w:p>
-    <w:p>
-      <w:pPr>
-        <w:spacing w:after="240" w:before="240" w:lineRule="auto"/>
-        <w:rPr/>
-      </w:pPr>
-      <w:r>
-        <w:rPr>
-          <w:rtl w:val="0"/>
-        </w:rPr>
-        <w:t xml:space="preserve">Promising Opportunity</w:t>
-      </w:r>
-    </w:p>
-    <w:p>
-      <w:pPr>
-        <w:spacing w:after="240" w:before="240" w:lineRule="auto"/>
-        <w:rPr/>
-      </w:pPr>
-      <w:r>
-        <w:rPr>
-          <w:rtl w:val="0"/>
-        </w:rPr>
-        <w:t xml:space="preserve">Needs testing and refinement.</w:t>
-      </w:r>
-    </w:p>
-    <w:p>
-      <w:pPr>
-        <w:pStyle w:val="Heading2"/>
-        <w:keepNext w:val="0"/>
-        <w:keepLines w:val="0"/>
-        <w:spacing w:after="80" w:lineRule="auto"/>
-        <w:rPr>
-          <w:b w:val="1"/>
-          <w:bCs w:val="1"/>
-          <w:sz w:val="34"/>
-          <w:szCs w:val="34"/>
-        </w:rPr>
-      </w:pPr>
-      <w:bookmarkStart w:colFirst="0" w:colLast="0" w:name="_ruee7571ofnm" w:id="81"/>
-      <w:bookmarkEnd w:id="81"/>
-      <w:r>
-        <w:rPr>
-          <w:b w:val="1"/>
-          <w:bCs w:val="1"/>
-          <w:sz w:val="34"/>
-          <w:szCs w:val="34"/>
-          <w:rtl w:val="0"/>
-        </w:rPr>
-        <w:t xml:space="preserve">30-44:</w:t>
-      </w:r>
-    </w:p>
-    <w:p>
-      <w:pPr>
-        <w:spacing w:after="240" w:before="240" w:lineRule="auto"/>
-        <w:rPr/>
-      </w:pPr>
-      <w:r>
-        <w:rPr>
-          <w:rtl w:val="0"/>
-        </w:rPr>
-        <w:t xml:space="preserve">Needs Improvement</w:t>
-      </w:r>
-    </w:p>
-    <w:p>
-      <w:pPr>
-        <w:spacing w:after="240" w:before="240" w:lineRule="auto"/>
-        <w:rPr/>
-      </w:pPr>
-      <w:r>
-        <w:rPr>
-          <w:rtl w:val="0"/>
-        </w:rPr>
-        <w:t xml:space="preserve">Major assumptions require validation.</w:t>
-      </w:r>
-    </w:p>
-    <w:p>
-      <w:pPr>
-        <w:pStyle w:val="Heading2"/>
-        <w:keepNext w:val="0"/>
-        <w:keepLines w:val="0"/>
-        <w:spacing w:after="80" w:lineRule="auto"/>
-        <w:rPr>
-          <w:b w:val="1"/>
-          <w:bCs w:val="1"/>
-          <w:sz w:val="34"/>
-          <w:szCs w:val="34"/>
-        </w:rPr>
-      </w:pPr>
-      <w:bookmarkStart w:colFirst="0" w:colLast="0" w:name="_dvdvmxhxiww" w:id="82"/>
-      <w:bookmarkEnd w:id="82"/>
-      <w:r>
-        <w:rPr>
-          <w:b w:val="1"/>
-          <w:bCs w:val="1"/>
-          <w:sz w:val="34"/>
-          <w:szCs w:val="34"/>
-          <w:rtl w:val="0"/>
-        </w:rPr>
-        <w:t xml:space="preserve">Below 30:</w:t>
-      </w:r>
-    </w:p>
-    <w:p>
-      <w:pPr>
-        <w:spacing w:after="240" w:before="240" w:lineRule="auto"/>
-        <w:rPr/>
-      </w:pPr>
-      <w:r>
-        <w:rPr>
-          <w:rtl w:val="0"/>
-        </w:rPr>
-        <w:t xml:space="preserve">Weak Opportunity</w:t>
-      </w:r>
-    </w:p>
-    <w:p>
-      <w:pPr>
-        <w:spacing w:after="240" w:before="240" w:lineRule="auto"/>
-        <w:rPr/>
-      </w:pPr>
-      <w:r>
-        <w:rPr>
-          <w:rtl w:val="0"/>
-        </w:rPr>
-        <w:t xml:space="preserve">Redesign or reconsider.</w:t>
-      </w:r>
-    </w:p>
-    <w:p>
-      <w:pPr>
-        <w:rPr/>
-      </w:pPr>
-      <w:r>
-        <w:pict>
-          <v:rect style="width:0.0pt;height:1.5pt" o:hr="t" o:hrstd="t" o:hralign="center" fillcolor="#A0A0A0" stroked="f"/>
-        </w:pict>
-      </w:r>
-      <w:r>
-        <w:rPr>
-          <w:rtl w:val="0"/>
-        </w:rPr>
-      </w:r>
-    </w:p>
-    <w:p>
-      <w:pPr>
-        <w:pStyle w:val="Heading1"/>
-        <w:keepNext w:val="0"/>
-        <w:keepLines w:val="0"/>
-        <w:spacing w:before="480" w:lineRule="auto"/>
-        <w:rPr>
-          <w:b w:val="1"/>
-          <w:bCs w:val="1"/>
-          <w:sz w:val="46"/>
-          <w:szCs w:val="46"/>
-        </w:rPr>
-      </w:pPr>
-      <w:bookmarkStart w:colFirst="0" w:colLast="0" w:name="_hj8o78dby2er" w:id="83"/>
-      <w:bookmarkEnd w:id="83"/>
-      <w:r>
-        <w:rPr>
-          <w:b w:val="1"/>
-          <w:bCs w:val="1"/>
-          <w:sz w:val="46"/>
-          <w:szCs w:val="46"/>
-          <w:rtl w:val="0"/>
-        </w:rPr>
-        <w:t xml:space="preserve">Final Intelligence Recommendation</w:t>
-      </w:r>
-    </w:p>
-    <w:p>
-      <w:pPr>
-        <w:spacing w:after="240" w:before="240" w:lineRule="auto"/>
-        <w:rPr/>
-      </w:pPr>
-      <w:r>
-        <w:rPr>
-          <w:rtl w:val="0"/>
-        </w:rPr>
-        <w:t xml:space="preserve">Based on the evidence:</w:t>
-      </w:r>
-    </w:p>
-    <w:p>
-      <w:pPr>
-        <w:spacing w:after="240" w:before="240" w:lineRule="auto"/>
-        <w:rPr>
-          <w:b w:val="1"/>
-          <w:bCs w:val="1"/>
-        </w:rPr>
-      </w:pPr>
-      <w:r>
-        <w:rPr>
-          <w:b w:val="1"/>
-          <w:bCs w:val="1"/>
-          <w:rtl w:val="0"/>
-        </w:rPr>
-        <w:t xml:space="preserve">Opportunity Rating:</w:t>
-      </w:r>
-    </w:p>
-    <w:p>
-      <w:pPr>
-        <w:spacing w:after="240" w:before="240" w:lineRule="auto"/>
-        <w:rPr>
-          <w:b w:val="1"/>
-          <w:bCs w:val="1"/>
-        </w:rPr>
-      </w:pPr>
-      <w:r>
-        <w:rPr>
-          <w:b w:val="1"/>
-          <w:bCs w:val="1"/>
-          <w:rtl w:val="0"/>
-        </w:rPr>
-        <w:t xml:space="preserve">Key Strengths:</w:t>
-      </w:r>
-    </w:p>
-    <w:p>
-      <w:pPr>
-        <w:spacing w:after="240" w:before="240" w:lineRule="auto"/>
-        <w:rPr>
-          <w:b w:val="1"/>
-          <w:bCs w:val="1"/>
-        </w:rPr>
-      </w:pPr>
-      <w:r>
-        <w:rPr>
-          <w:b w:val="1"/>
-          <w:bCs w:val="1"/>
-          <w:rtl w:val="0"/>
-        </w:rPr>
-        <w:t xml:space="preserve">Main Concerns:</w:t>
-      </w:r>
-    </w:p>
-    <w:p>
-      <w:pPr>
-        <w:spacing w:after="240" w:before="240" w:lineRule="auto"/>
-        <w:rPr>
-          <w:b w:val="1"/>
-          <w:bCs w:val="1"/>
-        </w:rPr>
-      </w:pPr>
-      <w:r>
-        <w:rPr>
-          <w:b w:val="1"/>
-          <w:bCs w:val="1"/>
-          <w:rtl w:val="0"/>
-        </w:rPr>
-        <w:t xml:space="preserve">Recommended Next Step:</w:t>
-      </w:r>
-    </w:p>
-    <w:p>
-      <w:pPr>
-        <w:rPr/>
-      </w:pPr>
-      <w:r>
-        <w:rPr>
-          <w:rtl w:val="0"/>
-        </w:rPr>
       </w:r>
     </w:p>
     <w:sectPr>

</xml_diff>